<commit_message>
fix: corrected fonts + colors
</commit_message>
<xml_diff>
--- a/cvtool-backend/src/main/resources/demo/CV_NL_VOORBEELD.docx
+++ b/cvtool-backend/src/main/resources/demo/CV_NL_VOORBEELD.docx
@@ -1,6 +1,6 @@
 
 <file path=word/document.xml><?xml version="1.0" encoding="utf-8"?>
-<w:document xmlns:w="http://purl.oclc.org/ooxml/wordprocessingml/main" xmlns:wp="http://purl.oclc.org/ooxml/drawingml/wordprocessingDrawing" xmlns:wne="http://schemas.microsoft.com/office/word/2006/wordml" xmlns:r="http://purl.oclc.org/ooxml/officeDocument/relationships" xmlns:mc="http://schemas.openxmlformats.org/markup-compatibility/2006" xmlns:w14="http://schemas.microsoft.com/office/word/2010/wordml" xmlns:wp14="http://schemas.microsoft.com/office/word/2010/wordprocessingDrawing" mc:Ignorable="w14 wne wp14" w:conformance="strict">
+<w:document xmlns:cx="http://schemas.microsoft.com/office/drawing/2014/chartex" xmlns:cx1="http://schemas.microsoft.com/office/drawing/2015/9/8/chartex" xmlns:cx2="http://schemas.microsoft.com/office/drawing/2015/10/21/chartex" xmlns:cx3="http://schemas.microsoft.com/office/drawing/2016/5/9/chartex" xmlns:cx4="http://schemas.microsoft.com/office/drawing/2016/5/10/chartex" xmlns:cx5="http://schemas.microsoft.com/office/drawing/2016/5/11/chartex" xmlns:cx6="http://schemas.microsoft.com/office/drawing/2016/5/12/chartex" xmlns:cx7="http://schemas.microsoft.com/office/drawing/2016/5/13/chartex" xmlns:cx8="http://schemas.microsoft.com/office/drawing/2016/5/14/chartex" xmlns:mc="http://schemas.openxmlformats.org/markup-compatibility/2006" xmlns:aink="http://schemas.microsoft.com/office/drawing/2016/ink" xmlns:am3d="http://schemas.microsoft.com/office/drawing/2017/model3d" xmlns:o="urn:schemas-microsoft-com:office:office" xmlns:oel="http://schemas.microsoft.com/office/2019/extlst" xmlns:r="http://purl.oclc.org/ooxml/officeDocument/relationships" xmlns:m="http://purl.oclc.org/ooxml/officeDocument/math" xmlns:v="urn:schemas-microsoft-com:vml" xmlns:wp14="http://schemas.microsoft.com/office/word/2010/wordprocessingDrawing" xmlns:wp="http://purl.oclc.org/ooxml/drawingml/wordprocessingDrawing" xmlns:w10="urn:schemas-microsoft-com:office:word" xmlns:w="http://purl.oclc.org/ooxml/wordprocessingml/main" xmlns:w14="http://schemas.microsoft.com/office/word/2010/wordml" xmlns:w15="http://schemas.microsoft.com/office/word/2012/wordml" xmlns:w16cei="http://schemas.microsoft.com/office/word/2026/wordml/cei" xmlns:w16cex="http://schemas.microsoft.com/office/word/2018/wordml/cex" xmlns:w16cid="http://schemas.microsoft.com/office/word/2016/wordml/cid" xmlns:w16="http://schemas.microsoft.com/office/word/2018/wordml" xmlns:w16du="http://schemas.microsoft.com/office/word/2023/wordml/word16du" xmlns:w16sdtdh="http://schemas.microsoft.com/office/word/2020/wordml/sdtdatahash" xmlns:w16sdtfl="http://schemas.microsoft.com/office/word/2024/wordml/sdtformatlock" xmlns:w16se="http://schemas.microsoft.com/office/word/2015/wordml/symex" xmlns:wpi="http://schemas.microsoft.com/office/word/2010/wordprocessingInk" xmlns:wne="http://schemas.microsoft.com/office/word/2006/wordml" mc:Ignorable="w14 w15 w16se w16cid w16 w16cex w16sdtdh w16sdtfl w16du wne wp14" w:conformance="strict">
   <w:body>
     <w:p>
       <w:r>
@@ -8,7 +8,7 @@
           <w:noProof/>
         </w:rPr>
         <w:drawing>
-          <wp:anchor distT="0" distB="0" distL="114300" distR="114300" simplePos="0" relativeHeight="251668480" behindDoc="0" locked="0" layoutInCell="1" allowOverlap="1" wp14:anchorId="413458E8" wp14:editId="0D83563D">
+          <wp:anchor distT="0" distB="0" distL="114300" distR="114300" simplePos="0" relativeHeight="251652096" behindDoc="0" locked="0" layoutInCell="1" allowOverlap="1" wp14:anchorId="413458E8" wp14:editId="0D83563D">
             <wp:simplePos x="0" y="0"/>
             <wp:positionH relativeFrom="column">
               <wp:posOffset>4987412</wp:posOffset>
@@ -93,7 +93,7 @@
           <w:noProof/>
         </w:rPr>
         <w:drawing>
-          <wp:anchor distT="0" distB="0" distL="114300" distR="114300" simplePos="0" relativeHeight="251664384" behindDoc="0" locked="0" layoutInCell="1" allowOverlap="1" wp14:anchorId="1541F9EA" wp14:editId="27C48E51">
+          <wp:anchor distT="0" distB="0" distL="114300" distR="114300" simplePos="0" relativeHeight="251650048" behindDoc="0" locked="0" layoutInCell="1" allowOverlap="1" wp14:anchorId="1541F9EA" wp14:editId="27C48E51">
             <wp:simplePos x="0" y="0"/>
             <wp:positionH relativeFrom="column">
               <wp:posOffset>3280631</wp:posOffset>
@@ -172,7 +172,7 @@
           <w:noProof/>
         </w:rPr>
         <w:drawing>
-          <wp:anchor distT="0" distB="0" distL="114300" distR="114300" simplePos="0" relativeHeight="251666432" behindDoc="0" locked="0" layoutInCell="1" allowOverlap="1" wp14:anchorId="114F53A9" wp14:editId="7DE7FBAF">
+          <wp:anchor distT="0" distB="0" distL="114300" distR="114300" simplePos="0" relativeHeight="251651072" behindDoc="0" locked="0" layoutInCell="1" allowOverlap="1" wp14:anchorId="114F53A9" wp14:editId="7DE7FBAF">
             <wp:simplePos x="0" y="0"/>
             <wp:positionH relativeFrom="column">
               <wp:posOffset>3279775</wp:posOffset>
@@ -296,7 +296,7 @@
           <w:noProof/>
         </w:rPr>
         <w:drawing>
-          <wp:anchor distT="0" distB="0" distL="114300" distR="114300" simplePos="0" relativeHeight="251656190" behindDoc="1" locked="0" layoutInCell="1" allowOverlap="1" wp14:anchorId="72854C67" wp14:editId="5C654BAF">
+          <wp:anchor distT="0" distB="0" distL="114300" distR="114300" simplePos="0" relativeHeight="251646976" behindDoc="1" locked="0" layoutInCell="1" allowOverlap="1" wp14:anchorId="72854C67" wp14:editId="5C654BAF">
             <wp:simplePos x="0" y="0"/>
             <wp:positionH relativeFrom="column">
               <wp:posOffset>-912752</wp:posOffset>
@@ -350,7 +350,7 @@
           <w:noProof/>
         </w:rPr>
         <w:drawing>
-          <wp:anchor distT="0" distB="0" distL="114300" distR="114300" simplePos="0" relativeHeight="251678720" behindDoc="1" locked="0" layoutInCell="1" allowOverlap="1" wp14:anchorId="41AA082E" wp14:editId="32279833">
+          <wp:anchor distT="0" distB="0" distL="114300" distR="114300" simplePos="0" relativeHeight="251658240" behindDoc="1" locked="0" layoutInCell="1" allowOverlap="1" wp14:anchorId="41AA082E" wp14:editId="32279833">
             <wp:simplePos x="0" y="0"/>
             <wp:positionH relativeFrom="column">
               <wp:posOffset>194310</wp:posOffset>
@@ -410,7 +410,7 @@
           <w:noProof/>
         </w:rPr>
         <w:drawing>
-          <wp:anchor distT="0" distB="0" distL="114300" distR="114300" simplePos="0" relativeHeight="251660288" behindDoc="0" locked="0" layoutInCell="1" allowOverlap="1" wp14:anchorId="24CE036A" wp14:editId="6DEFC1A3">
+          <wp:anchor distT="0" distB="0" distL="114300" distR="114300" simplePos="0" relativeHeight="251648000" behindDoc="0" locked="0" layoutInCell="1" allowOverlap="1" wp14:anchorId="24CE036A" wp14:editId="6DEFC1A3">
             <wp:simplePos x="0" y="0"/>
             <wp:positionH relativeFrom="column">
               <wp:posOffset>-184785</wp:posOffset>
@@ -488,8 +488,14 @@
       </w:r>
       <w:r>
         <w:br/>
+      </w:r>
+      <w:r>
         <w:br/>
+      </w:r>
+      <w:r>
         <w:br/>
+      </w:r>
+      <w:r>
         <w:br/>
       </w:r>
     </w:p>
@@ -522,7 +528,7 @@
           <w:noProof/>
         </w:rPr>
         <w:drawing>
-          <wp:anchor distT="0" distB="0" distL="114300" distR="114300" simplePos="0" relativeHeight="251689984" behindDoc="0" locked="0" layoutInCell="1" allowOverlap="1" wp14:anchorId="53C0D026" wp14:editId="3AB696FB">
+          <wp:anchor distT="0" distB="0" distL="114300" distR="114300" simplePos="0" relativeHeight="251662336" behindDoc="0" locked="0" layoutInCell="1" allowOverlap="1" wp14:anchorId="53C0D026" wp14:editId="3AB696FB">
             <wp:simplePos x="0" y="0"/>
             <wp:positionH relativeFrom="column">
               <wp:posOffset>-454025</wp:posOffset>
@@ -582,7 +588,7 @@
           <w:noProof/>
         </w:rPr>
         <w:drawing>
-          <wp:anchor distT="0" distB="0" distL="114300" distR="114300" simplePos="0" relativeHeight="251655165" behindDoc="1" locked="0" layoutInCell="1" allowOverlap="1" wp14:anchorId="52B7CF1E" wp14:editId="31659129">
+          <wp:anchor distT="0" distB="0" distL="114300" distR="114300" simplePos="0" relativeHeight="251645952" behindDoc="1" locked="0" layoutInCell="1" allowOverlap="1" wp14:anchorId="52B7CF1E" wp14:editId="31659129">
             <wp:simplePos x="0" y="0"/>
             <wp:positionH relativeFrom="column">
               <wp:posOffset>3383915</wp:posOffset>
@@ -638,7 +644,7 @@
           <w:noProof/>
         </w:rPr>
         <w:drawing>
-          <wp:anchor distT="0" distB="0" distL="114300" distR="114300" simplePos="0" relativeHeight="251669504" behindDoc="0" locked="0" layoutInCell="1" allowOverlap="1" wp14:anchorId="5A312803" wp14:editId="2FFD9698">
+          <wp:anchor distT="0" distB="0" distL="114300" distR="114300" simplePos="0" relativeHeight="251654144" behindDoc="0" locked="0" layoutInCell="1" allowOverlap="1" wp14:anchorId="5A312803" wp14:editId="2FFD9698">
             <wp:simplePos x="0" y="0"/>
             <wp:positionH relativeFrom="column">
               <wp:posOffset>-545123</wp:posOffset>
@@ -674,8 +680,14 @@
                         <w:pPr>
                           <w:pStyle w:val="Titel1"/>
                           <w:spacing w:after="12pt"/>
+                          <w:rPr>
+                            <w:lang w:val="nl-NL"/>
+                          </w:rPr>
                         </w:pPr>
                         <w:r>
+                          <w:rPr>
+                            <w:lang w:val="nl-NL"/>
+                          </w:rPr>
                           <w:t>Persoonlijk profiel</w:t>
                         </w:r>
                       </w:p>
@@ -683,103 +695,147 @@
                         <w:pPr>
                           <w:pStyle w:val="BasicParagraph"/>
                           <w:suppressAutoHyphens/>
+                          <w:rPr>
+                            <w:rFonts w:ascii="Plus Jakarta Sans" w:hAnsi="Plus Jakarta Sans"/>
+                          </w:rPr>
                         </w:pPr>
-                        <w:proofErr w:type="spellStart"/>
-                        <w:r>
-                          <w:rPr>
-                            <w:rFonts w:ascii="PlusJakartaSans-Regular" w:hAnsi="PlusJakartaSans-Regular" w:cs="PlusJakartaSans-Regular"/>
+                        <w:r>
+                          <w:rPr>
+                            <w:rFonts w:ascii="Plus Jakarta Sans" w:hAnsi="Plus Jakarta Sans" w:cs="PlusJakartaSans-Regular"/>
                             <w:color w:val="212B46"/>
                             <w:sz w:val="18"/>
                             <w:szCs w:val="18"/>
                           </w:rPr>
                           <w:t>Wat zijn jouw (unieke) skills, waar ben je goed in?</w:t>
                         </w:r>
-                        <w:proofErr w:type="spellEnd"/>
                       </w:p>
                       <w:p>
                         <w:pPr>
                           <w:pStyle w:val="BasicParagraph"/>
                           <w:suppressAutoHyphens/>
+                          <w:rPr>
+                            <w:rFonts w:ascii="Plus Jakarta Sans" w:hAnsi="Plus Jakarta Sans"/>
+                          </w:rPr>
                         </w:pPr>
-                        <w:proofErr w:type="spellStart"/>
-                        <w:r>
-                          <w:rPr>
-                            <w:rFonts w:ascii="PlusJakartaSans-Regular" w:hAnsi="PlusJakartaSans-Regular" w:cs="PlusJakartaSans-Regular"/>
+                        <w:r>
+                          <w:rPr>
+                            <w:rFonts w:ascii="Plus Jakarta Sans" w:hAnsi="Plus Jakarta Sans" w:cs="PlusJakartaSans-Regular"/>
                             <w:color w:val="212B46"/>
                             <w:sz w:val="18"/>
                             <w:szCs w:val="18"/>
                           </w:rPr>
                           <w:t>Hoe komt dit naar voren tijdens het werk?</w:t>
                         </w:r>
-                        <w:proofErr w:type="spellEnd"/>
                       </w:p>
                       <w:p>
                         <w:pPr>
                           <w:pStyle w:val="BasicParagraph"/>
                           <w:suppressAutoHyphens/>
+                          <w:rPr>
+                            <w:rFonts w:ascii="Plus Jakarta Sans" w:hAnsi="Plus Jakarta Sans"/>
+                          </w:rPr>
                         </w:pPr>
-                        <w:proofErr w:type="spellStart"/>
-                        <w:r>
-                          <w:rPr>
-                            <w:rFonts w:ascii="PlusJakartaSans-Regular" w:hAnsi="PlusJakartaSans-Regular" w:cs="PlusJakartaSans-Regular"/>
+                        <w:r>
+                          <w:rPr>
+                            <w:rFonts w:ascii="Plus Jakarta Sans" w:hAnsi="Plus Jakarta Sans" w:cs="PlusJakartaSans-Regular"/>
                             <w:color w:val="212B46"/>
                             <w:sz w:val="18"/>
                             <w:szCs w:val="18"/>
                           </w:rPr>
                           <w:t>Waarom moeten klanten jouw hebben in hun team?</w:t>
                         </w:r>
-                        <w:proofErr w:type="spellEnd"/>
                       </w:p>
                       <w:p>
                         <w:pPr>
                           <w:pStyle w:val="BasicParagraph"/>
                           <w:suppressAutoHyphens/>
+                          <w:rPr>
+                            <w:rFonts w:ascii="Plus Jakarta Sans" w:hAnsi="Plus Jakarta Sans"/>
+                            <w:lang w:val="en-US"/>
+                          </w:rPr>
                         </w:pPr>
-                        <w:proofErr w:type="spellStart"/>
-                        <w:r>
-                          <w:rPr>
-                            <w:rFonts w:ascii="PlusJakartaSans-Regular" w:hAnsi="PlusJakartaSans-Regular" w:cs="PlusJakartaSans-Regular"/>
+                        <w:r>
+                          <w:rPr>
+                            <w:rFonts w:ascii="Plus Jakarta Sans" w:hAnsi="Plus Jakarta Sans" w:cs="PlusJakartaSans-Regular"/>
                             <w:color w:val="212B46"/>
                             <w:sz w:val="18"/>
                             <w:szCs w:val="18"/>
-                          </w:rPr>
-                          <w:t>(zowel qua hard skills als soft skills)</w:t>
+                            <w:lang w:val="en-US"/>
+                          </w:rPr>
+                          <w:t>(</w:t>
+                        </w:r>
+                        <w:proofErr w:type="spellStart"/>
+                        <w:r>
+                          <w:rPr>
+                            <w:rFonts w:ascii="Plus Jakarta Sans" w:hAnsi="Plus Jakarta Sans" w:cs="PlusJakartaSans-Regular"/>
+                            <w:color w:val="212B46"/>
+                            <w:sz w:val="18"/>
+                            <w:szCs w:val="18"/>
+                            <w:lang w:val="en-US"/>
+                          </w:rPr>
+                          <w:t>zowel</w:t>
                         </w:r>
                         <w:proofErr w:type="spellEnd"/>
+                        <w:r>
+                          <w:rPr>
+                            <w:rFonts w:ascii="Plus Jakarta Sans" w:hAnsi="Plus Jakarta Sans" w:cs="PlusJakartaSans-Regular"/>
+                            <w:color w:val="212B46"/>
+                            <w:sz w:val="18"/>
+                            <w:szCs w:val="18"/>
+                            <w:lang w:val="en-US"/>
+                          </w:rPr>
+                          <w:t xml:space="preserve"> qua hard skills </w:t>
+                        </w:r>
+                        <w:proofErr w:type="spellStart"/>
+                        <w:r>
+                          <w:rPr>
+                            <w:rFonts w:ascii="Plus Jakarta Sans" w:hAnsi="Plus Jakarta Sans" w:cs="PlusJakartaSans-Regular"/>
+                            <w:color w:val="212B46"/>
+                            <w:sz w:val="18"/>
+                            <w:szCs w:val="18"/>
+                            <w:lang w:val="en-US"/>
+                          </w:rPr>
+                          <w:t>als</w:t>
+                        </w:r>
+                        <w:proofErr w:type="spellEnd"/>
+                        <w:r>
+                          <w:rPr>
+                            <w:rFonts w:ascii="Plus Jakarta Sans" w:hAnsi="Plus Jakarta Sans" w:cs="PlusJakartaSans-Regular"/>
+                            <w:color w:val="212B46"/>
+                            <w:sz w:val="18"/>
+                            <w:szCs w:val="18"/>
+                            <w:lang w:val="en-US"/>
+                          </w:rPr>
+                          <w:t xml:space="preserve"> soft skills)</w:t>
+                        </w:r>
                       </w:p>
                       <w:p>
                         <w:pPr>
                           <w:pStyle w:val="BasicParagraph"/>
                           <w:suppressAutoHyphens/>
+                          <w:rPr>
+                            <w:rFonts w:ascii="Plus Jakarta Sans" w:hAnsi="Plus Jakarta Sans"/>
+                            <w:lang w:val="en-US"/>
+                          </w:rPr>
                         </w:pPr>
-                        <w:proofErr w:type="spellStart"/>
-                        <w:r>
-                          <w:rPr>
-                            <w:rFonts w:ascii="PlusJakartaSans-Regular" w:hAnsi="PlusJakartaSans-Regular" w:cs="PlusJakartaSans-Regular"/>
-                            <w:color w:val="212B46"/>
-                            <w:sz w:val="18"/>
-                            <w:szCs w:val="18"/>
-                          </w:rPr>
-                          <w:t/>
-                        </w:r>
-                        <w:proofErr w:type="spellEnd"/>
                       </w:p>
                       <w:p>
                         <w:pPr>
                           <w:pStyle w:val="BasicParagraph"/>
                           <w:suppressAutoHyphens/>
+                          <w:rPr>
+                            <w:rFonts w:ascii="Plus Jakarta Sans" w:hAnsi="Plus Jakarta Sans"/>
+                          </w:rPr>
                         </w:pPr>
-                        <w:proofErr w:type="spellStart"/>
-                        <w:r>
-                          <w:rPr>
-                            <w:rFonts w:ascii="PlusJakartaSans-Regular" w:hAnsi="PlusJakartaSans-Regular" w:cs="PlusJakartaSans-Regular"/>
+                        <w:r>
+                          <w:rPr>
+                            <w:rFonts w:ascii="Plus Jakarta Sans" w:hAnsi="Plus Jakarta Sans" w:cs="PlusJakartaSans-Regular"/>
                             <w:color w:val="212B46"/>
                             <w:sz w:val="18"/>
                             <w:szCs w:val="18"/>
                           </w:rPr>
                           <w:t>Houd dit kort (niet te kort) maar krachtig!</w:t>
                         </w:r>
-                        <w:proofErr w:type="spellEnd"/>
                       </w:p>
                     </wne:txbxContent>
                   </wp:txbx>
@@ -806,7 +862,7 @@
           <w:noProof/>
         </w:rPr>
         <w:drawing>
-          <wp:anchor distT="0" distB="0" distL="114300" distR="114300" simplePos="0" relativeHeight="251671552" behindDoc="0" locked="0" layoutInCell="1" allowOverlap="1" wp14:anchorId="6159BDFF" wp14:editId="357C47DF">
+          <wp:anchor distT="0" distB="0" distL="114300" distR="114300" simplePos="0" relativeHeight="251655168" behindDoc="0" locked="0" layoutInCell="1" allowOverlap="1" wp14:anchorId="6159BDFF" wp14:editId="357C47DF">
             <wp:simplePos x="0" y="0"/>
             <wp:positionH relativeFrom="column">
               <wp:posOffset>2840355</wp:posOffset>
@@ -860,7 +916,7 @@
           <w:noProof/>
         </w:rPr>
         <w:drawing>
-          <wp:anchor distT="0" distB="0" distL="114300" distR="114300" simplePos="0" relativeHeight="251674624" behindDoc="0" locked="0" layoutInCell="1" allowOverlap="1" wp14:anchorId="783536A8" wp14:editId="7BDDF852">
+          <wp:anchor distT="0" distB="0" distL="114300" distR="114300" simplePos="0" relativeHeight="251656192" behindDoc="0" locked="0" layoutInCell="1" allowOverlap="1" wp14:anchorId="783536A8" wp14:editId="7BDDF852">
             <wp:simplePos x="0" y="0"/>
             <wp:positionH relativeFrom="column">
               <wp:posOffset>-546100</wp:posOffset>
@@ -936,7 +992,7 @@
           <w:noProof/>
         </w:rPr>
         <w:drawing>
-          <wp:anchor distT="0" distB="0" distL="114300" distR="114300" simplePos="0" relativeHeight="251668991" behindDoc="0" locked="0" layoutInCell="1" allowOverlap="1" wp14:anchorId="3D5826BC" wp14:editId="0D8C587B">
+          <wp:anchor distT="0" distB="0" distL="114300" distR="114300" simplePos="0" relativeHeight="251653120" behindDoc="0" locked="0" layoutInCell="1" allowOverlap="1" wp14:anchorId="3D5826BC" wp14:editId="0D8C587B">
             <wp:simplePos x="0" y="0"/>
             <wp:positionH relativeFrom="column">
               <wp:posOffset>-546735</wp:posOffset>
@@ -1000,8 +1056,11 @@
         </w:drawing>
       </w:r>
       <w:r>
+        <w:rPr>
+          <w:noProof/>
+        </w:rPr>
         <w:drawing>
-          <wp:anchor distT="0" distB="0" distL="114300" distR="114300" simplePos="0" relativeHeight="251702272" behindDoc="0" locked="0" layoutInCell="1" allowOverlap="1" wp14:anchorId="67CF79A2" wp14:editId="50F8A87B">
+          <wp:anchor distT="0" distB="0" distL="114300" distR="114300" simplePos="0" relativeHeight="251667456" behindDoc="0" locked="0" layoutInCell="1" allowOverlap="1" wp14:anchorId="67CF79A2" wp14:editId="50F8A87B">
             <wp:simplePos x="0" y="0"/>
             <wp:positionH relativeFrom="column">
               <wp:posOffset>-453390</wp:posOffset>
@@ -1057,8 +1116,11 @@
         </w:drawing>
       </w:r>
       <w:r>
+        <w:rPr>
+          <w:noProof/>
+        </w:rPr>
         <w:drawing>
-          <wp:anchor distT="0" distB="0" distL="114300" distR="114300" simplePos="0" relativeHeight="251675648" behindDoc="0" locked="0" layoutInCell="1" allowOverlap="1" wp14:anchorId="4527B553" wp14:editId="74321C57">
+          <wp:anchor distT="0" distB="0" distL="114300" distR="114300" simplePos="0" relativeHeight="251657216" behindDoc="0" locked="0" layoutInCell="1" allowOverlap="1" wp14:anchorId="4527B553" wp14:editId="74321C57">
             <wp:simplePos x="0" y="0"/>
             <wp:positionH relativeFrom="column">
               <wp:posOffset>-542925</wp:posOffset>
@@ -1093,23 +1155,52 @@
                       <w:p>
                         <w:pPr>
                           <w:pStyle w:val="Titel1"/>
+                          <w:rPr>
+                            <w:lang w:val="nl-NL"/>
+                          </w:rPr>
                         </w:pPr>
                         <w:r>
+                          <w:rPr>
+                            <w:lang w:val="nl-NL"/>
+                          </w:rPr>
                           <w:t>Interesses</w:t>
                         </w:r>
                       </w:p>
                       <w:p>
                         <w:pPr>
                           <w:spacing w:before="12pt"/>
+                          <w:rPr>
+                            <w:color w:val="212B46"/>
+                          </w:rPr>
                         </w:pPr>
                         <w:r>
                           <w:rPr>
                             <w:rFonts w:ascii="Plus Jakarta Sans" w:hAnsi="Plus Jakarta Sans"/>
+                            <w:color w:val="212B46"/>
                             <w:sz w:val="18"/>
                             <w:szCs w:val="18"/>
                           </w:rPr>
-                          <w:t>Welke interesses/hobby’s heb je?
-(kort in 1 of 2 regels, werk met komma’s)</w:t>
+                          <w:t>Welke interesses/hobby’s heb je? (</w:t>
+                        </w:r>
+                        <w:proofErr w:type="gramStart"/>
+                        <w:r>
+                          <w:rPr>
+                            <w:rFonts w:ascii="Plus Jakarta Sans" w:hAnsi="Plus Jakarta Sans"/>
+                            <w:color w:val="212B46"/>
+                            <w:sz w:val="18"/>
+                            <w:szCs w:val="18"/>
+                          </w:rPr>
+                          <w:t>kort</w:t>
+                        </w:r>
+                        <w:proofErr w:type="gramEnd"/>
+                        <w:r>
+                          <w:rPr>
+                            <w:rFonts w:ascii="Plus Jakarta Sans" w:hAnsi="Plus Jakarta Sans"/>
+                            <w:color w:val="212B46"/>
+                            <w:sz w:val="18"/>
+                            <w:szCs w:val="18"/>
+                          </w:rPr>
+                          <w:t xml:space="preserve"> in 1 of 2 regels, werk met komma’s)</w:t>
                         </w:r>
                       </w:p>
                     </wne:txbxContent>
@@ -1142,16 +1233,19 @@
       <w:pPr>
         <w:pStyle w:val="Titel1"/>
       </w:pPr>
-      <w:keepNext/>
       <w:r>
         <w:rPr>
           <w:noProof/>
         </w:rPr>
-        <w:r>
-          <w:t>Kerncompetenties / skills</w:t>
-        </w:r>
+        <w:lastRenderedPageBreak/>
+        <w:t>Kerncompetenties / skills</w:t>
+      </w:r>
+      <w:r>
+        <w:rPr>
+          <w:noProof/>
+        </w:rPr>
         <w:drawing>
-          <wp:anchor distT="0" distB="0" distL="114300" distR="114300" simplePos="0" relativeHeight="251692032" behindDoc="0" locked="0" layoutInCell="1" allowOverlap="1" wp14:anchorId="1ABC1FD6" wp14:editId="1FAFAECC">
+          <wp:anchor distT="0" distB="0" distL="114300" distR="114300" simplePos="0" relativeHeight="251663360" behindDoc="0" locked="0" layoutInCell="1" allowOverlap="1" wp14:anchorId="1ABC1FD6" wp14:editId="1FAFAECC">
             <wp:simplePos x="0" y="0"/>
             <wp:positionH relativeFrom="column">
               <wp:posOffset>-635</wp:posOffset>
@@ -1211,7 +1305,7 @@
           <w:noProof/>
         </w:rPr>
         <w:drawing>
-          <wp:anchor distT="0" distB="0" distL="114300" distR="114300" simplePos="0" relativeHeight="251683840" behindDoc="0" locked="0" layoutInCell="1" allowOverlap="1" wp14:anchorId="65A007C0" wp14:editId="5A8EF887">
+          <wp:anchor distT="0" distB="0" distL="114300" distR="114300" simplePos="0" relativeHeight="251659264" behindDoc="0" locked="0" layoutInCell="1" allowOverlap="1" wp14:anchorId="65A007C0" wp14:editId="5A8EF887">
             <wp:simplePos x="0" y="0"/>
             <wp:positionH relativeFrom="column">
               <wp:posOffset>-86116</wp:posOffset>
@@ -1252,6 +1346,7 @@
                           <w:rPr>
                             <w:rStyle w:val="A1"/>
                             <w:noProof/>
+                            <w:lang w:val="nl-NL"/>
                           </w:rPr>
                           <w:t>Branches</w:t>
                         </w:r>
@@ -1259,15 +1354,15 @@
                       <w:p>
                         <w:pPr>
                           <w:pStyle w:val="Niveau"/>
-                          <w:rPr>
-                            <w:color w:val="000000" w:themeColor="text1"/>
-                          </w:rPr>
+                          <w:keepNext/>
+                          <w:keepLines/>
                           <w:tabs>
                             <w:tab w:val="clear" w:pos="134.70pt"/>
                             <w:tab w:val="end" w:pos="163.05pt"/>
                           </w:tabs>
-                          <w:keepLines/>
-                          <w:keepNext/>
+                          <w:rPr>
+                            <w:color w:val="000000" w:themeColor="text1"/>
+                          </w:rPr>
                         </w:pPr>
                         <w:r>
                           <w:rPr>
@@ -1279,24 +1374,39 @@
                         <w:r>
                           <w:rPr>
                             <w:rStyle w:val="Cerios-niveau"/>
+                            <w:noProof/>
                             <w:color w:val="55DD94"/>
+                          </w:rPr>
+                          <w:tab/>
+                        </w:r>
+                        <w:r>
+                          <w:rPr>
+                            <w:rStyle w:val="Cerios-niveau"/>
                             <w:noProof/>
-                          </w:rPr>
-                          <w:tab/>
-                          <w:t></w:t>
+                            <w:color w:val="55DD94"/>
+                          </w:rPr>
+                          <w:t></w:t>
+                        </w:r>
+                        <w:r>
+                          <w:rPr>
+                            <w:rStyle w:val="Cerios-niveau"/>
+                            <w:noProof/>
+                            <w:color w:val="55DD94"/>
+                          </w:rPr>
+                          <w:t></w:t>
                         </w:r>
                       </w:p>
                       <w:p>
                         <w:pPr>
                           <w:pStyle w:val="Niveau"/>
-                          <w:rPr>
-                            <w:color w:val="000000" w:themeColor="text1"/>
-                          </w:rPr>
+                          <w:keepLines/>
                           <w:tabs>
                             <w:tab w:val="clear" w:pos="134.70pt"/>
                             <w:tab w:val="end" w:pos="163.05pt"/>
                           </w:tabs>
-                          <w:keepLines/>
+                          <w:rPr>
+                            <w:color w:val="000000" w:themeColor="text1"/>
+                          </w:rPr>
                         </w:pPr>
                         <w:r>
                           <w:rPr>
@@ -1308,23 +1418,41 @@
                         <w:r>
                           <w:rPr>
                             <w:rStyle w:val="Cerios-niveau"/>
+                            <w:noProof/>
                             <w:color w:val="55DD94"/>
+                          </w:rPr>
+                          <w:tab/>
+                        </w:r>
+                        <w:r>
+                          <w:rPr>
+                            <w:rStyle w:val="Cerios-niveau"/>
                             <w:noProof/>
-                          </w:rPr>
-                          <w:tab/>
-                          <w:t></w:t>
+                            <w:color w:val="55DD94"/>
+                          </w:rPr>
+                          <w:t></w:t>
+                        </w:r>
+                        <w:r>
+                          <w:rPr>
+                            <w:rStyle w:val="Cerios-niveau"/>
+                            <w:noProof/>
+                            <w:color w:val="55DD94"/>
+                          </w:rPr>
+                          <w:t></w:t>
                         </w:r>
                       </w:p>
-                      <w:br/>
                       <w:p>
                         <w:pPr>
                           <w:pStyle w:val="BasicParagraph"/>
                           <w:spacing w:line="13.80pt" w:lineRule="auto"/>
                         </w:pPr>
                         <w:r>
+                          <w:br/>
+                        </w:r>
+                        <w:r>
                           <w:rPr>
                             <w:rStyle w:val="A1"/>
                             <w:noProof/>
+                            <w:lang w:val="nl-NL"/>
                           </w:rPr>
                           <w:t>Expertises</w:t>
                         </w:r>
@@ -1332,14 +1460,14 @@
                       <w:p>
                         <w:pPr>
                           <w:pStyle w:val="Niveau"/>
-                          <w:rPr>
-                            <w:color w:val="000000" w:themeColor="text1"/>
-                          </w:rPr>
+                          <w:keepLines/>
                           <w:tabs>
                             <w:tab w:val="clear" w:pos="134.70pt"/>
                             <w:tab w:val="end" w:pos="163.05pt"/>
                           </w:tabs>
-                          <w:keepLines/>
+                          <w:rPr>
+                            <w:color w:val="000000" w:themeColor="text1"/>
+                          </w:rPr>
                         </w:pPr>
                         <w:r>
                           <w:rPr>
@@ -1351,23 +1479,49 @@
                         <w:r>
                           <w:rPr>
                             <w:rStyle w:val="Cerios-niveau"/>
+                            <w:noProof/>
                             <w:color w:val="55DD94"/>
+                          </w:rPr>
+                          <w:tab/>
+                        </w:r>
+                        <w:r>
+                          <w:rPr>
+                            <w:rStyle w:val="Cerios-niveau"/>
                             <w:noProof/>
-                          </w:rPr>
-                          <w:tab/>
-                          <w:t></w:t>
+                            <w:color w:val="55DD94"/>
+                          </w:rPr>
+                          <w:t></w:t>
+                        </w:r>
+                        <w:r>
+                          <w:rPr>
+                            <w:rStyle w:val="Cerios-niveau"/>
+                            <w:noProof/>
+                            <w:color w:val="55DD94"/>
+                          </w:rPr>
+                          <w:t></w:t>
+                        </w:r>
+                        <w:r>
+                          <w:rPr>
+                            <w:rStyle w:val="Cerios-niveau"/>
+                            <w:noProof/>
+                            <w:color w:val="55DD94"/>
+                          </w:rPr>
+                          <w:t></w:t>
                         </w:r>
                       </w:p>
-                      <w:br/>
                       <w:p>
                         <w:pPr>
                           <w:pStyle w:val="BasicParagraph"/>
                           <w:spacing w:line="13.80pt" w:lineRule="auto"/>
                         </w:pPr>
                         <w:r>
+                          <w:br/>
+                        </w:r>
+                        <w:r>
                           <w:rPr>
                             <w:rStyle w:val="A1"/>
                             <w:noProof/>
+                            <w:lang w:val="nl-NL"/>
                           </w:rPr>
                           <w:t>Databases</w:t>
                         </w:r>
@@ -1375,14 +1529,14 @@
                       <w:p>
                         <w:pPr>
                           <w:pStyle w:val="Niveau"/>
-                          <w:rPr>
-                            <w:color w:val="000000" w:themeColor="text1"/>
-                          </w:rPr>
+                          <w:keepLines/>
                           <w:tabs>
                             <w:tab w:val="clear" w:pos="134.70pt"/>
                             <w:tab w:val="end" w:pos="163.05pt"/>
                           </w:tabs>
-                          <w:keepLines/>
+                          <w:rPr>
+                            <w:color w:val="000000" w:themeColor="text1"/>
+                          </w:rPr>
                         </w:pPr>
                         <w:r>
                           <w:rPr>
@@ -1394,23 +1548,41 @@
                         <w:r>
                           <w:rPr>
                             <w:rStyle w:val="Cerios-niveau"/>
+                            <w:noProof/>
                             <w:color w:val="55DD94"/>
+                          </w:rPr>
+                          <w:tab/>
+                        </w:r>
+                        <w:r>
+                          <w:rPr>
+                            <w:rStyle w:val="Cerios-niveau"/>
                             <w:noProof/>
-                          </w:rPr>
-                          <w:tab/>
-                          <w:t></w:t>
+                            <w:color w:val="55DD94"/>
+                          </w:rPr>
+                          <w:t></w:t>
+                        </w:r>
+                        <w:r>
+                          <w:rPr>
+                            <w:rStyle w:val="Cerios-niveau"/>
+                            <w:noProof/>
+                            <w:color w:val="55DD94"/>
+                          </w:rPr>
+                          <w:t></w:t>
                         </w:r>
                       </w:p>
-                      <w:br/>
                       <w:p>
                         <w:pPr>
                           <w:pStyle w:val="BasicParagraph"/>
                           <w:spacing w:line="13.80pt" w:lineRule="auto"/>
                         </w:pPr>
                         <w:r>
+                          <w:br/>
+                        </w:r>
+                        <w:r>
                           <w:rPr>
                             <w:rStyle w:val="A1"/>
                             <w:noProof/>
+                            <w:lang w:val="nl-NL"/>
                           </w:rPr>
                           <w:t>Talenkennis</w:t>
                         </w:r>
@@ -1418,15 +1590,15 @@
                       <w:p>
                         <w:pPr>
                           <w:pStyle w:val="Niveau"/>
-                          <w:rPr>
-                            <w:color w:val="000000" w:themeColor="text1"/>
-                          </w:rPr>
+                          <w:keepNext/>
+                          <w:keepLines/>
                           <w:tabs>
                             <w:tab w:val="clear" w:pos="134.70pt"/>
                             <w:tab w:val="end" w:pos="163.05pt"/>
                           </w:tabs>
-                          <w:keepLines/>
-                          <w:keepNext/>
+                          <w:rPr>
+                            <w:color w:val="000000" w:themeColor="text1"/>
+                          </w:rPr>
                         </w:pPr>
                         <w:r>
                           <w:rPr>
@@ -1438,24 +1610,47 @@
                         <w:r>
                           <w:rPr>
                             <w:rStyle w:val="Cerios-niveau"/>
+                            <w:noProof/>
                             <w:color w:val="55DD94"/>
+                          </w:rPr>
+                          <w:tab/>
+                        </w:r>
+                        <w:r>
+                          <w:rPr>
+                            <w:rStyle w:val="Cerios-niveau"/>
                             <w:noProof/>
-                          </w:rPr>
-                          <w:tab/>
-                          <w:t></w:t>
+                            <w:color w:val="55DD94"/>
+                          </w:rPr>
+                          <w:t></w:t>
+                        </w:r>
+                        <w:r>
+                          <w:rPr>
+                            <w:rStyle w:val="Cerios-niveau"/>
+                            <w:noProof/>
+                            <w:color w:val="55DD94"/>
+                          </w:rPr>
+                          <w:t></w:t>
+                        </w:r>
+                        <w:r>
+                          <w:rPr>
+                            <w:rStyle w:val="Cerios-niveau"/>
+                            <w:noProof/>
+                            <w:color w:val="55DD94"/>
+                          </w:rPr>
+                          <w:t></w:t>
                         </w:r>
                       </w:p>
                       <w:p>
                         <w:pPr>
                           <w:pStyle w:val="Niveau"/>
-                          <w:rPr>
-                            <w:color w:val="000000" w:themeColor="text1"/>
-                          </w:rPr>
+                          <w:keepLines/>
                           <w:tabs>
                             <w:tab w:val="clear" w:pos="134.70pt"/>
                             <w:tab w:val="end" w:pos="163.05pt"/>
                           </w:tabs>
-                          <w:keepLines/>
+                          <w:rPr>
+                            <w:color w:val="000000" w:themeColor="text1"/>
+                          </w:rPr>
                         </w:pPr>
                         <w:r>
                           <w:rPr>
@@ -1467,14 +1662,33 @@
                         <w:r>
                           <w:rPr>
                             <w:rStyle w:val="Cerios-niveau"/>
+                            <w:noProof/>
                             <w:color w:val="55DD94"/>
+                          </w:rPr>
+                          <w:tab/>
+                        </w:r>
+                        <w:r>
+                          <w:rPr>
+                            <w:rStyle w:val="Cerios-niveau"/>
                             <w:noProof/>
-                          </w:rPr>
-                          <w:tab/>
-                          <w:t></w:t>
+                            <w:color w:val="55DD94"/>
+                          </w:rPr>
+                          <w:t></w:t>
+                        </w:r>
+                        <w:r>
+                          <w:rPr>
+                            <w:rStyle w:val="Cerios-niveau"/>
+                            <w:noProof/>
+                            <w:color w:val="55DD94"/>
+                          </w:rPr>
+                          <w:t></w:t>
                         </w:r>
                       </w:p>
-                      <w:br/>
+                      <w:p>
+                        <w:r>
+                          <w:br/>
+                        </w:r>
+                      </w:p>
                     </wne:txbxContent>
                   </wp:txbx>
                   <wp:bodyPr rot="0" spcFirstLastPara="0" vertOverflow="overflow" horzOverflow="overflow" vert="horz" wrap="square" lIns="91440" tIns="45720" rIns="91440" bIns="45720" numCol="1" spcCol="0" rtlCol="0" fromWordArt="0" anchor="t" anchorCtr="0" forceAA="0" compatLnSpc="1">
@@ -1500,7 +1714,7 @@
           <w:noProof/>
         </w:rPr>
         <w:drawing>
-          <wp:anchor distT="0" distB="0" distL="114300" distR="114300" simplePos="0" relativeHeight="251687936" behindDoc="0" locked="0" layoutInCell="1" allowOverlap="1" wp14:anchorId="35229AC4" wp14:editId="1074F567">
+          <wp:anchor distT="0" distB="0" distL="114300" distR="114300" simplePos="0" relativeHeight="251661312" behindDoc="0" locked="0" layoutInCell="1" allowOverlap="1" wp14:anchorId="35229AC4" wp14:editId="1074F567">
             <wp:simplePos x="0" y="0"/>
             <wp:positionH relativeFrom="column">
               <wp:posOffset>4514215</wp:posOffset>
@@ -1541,6 +1755,7 @@
                           <w:rPr>
                             <w:rStyle w:val="A1"/>
                             <w:noProof/>
+                            <w:lang w:val="nl-NL"/>
                           </w:rPr>
                           <w:t>Programmeren</w:t>
                         </w:r>
@@ -1548,14 +1763,14 @@
                       <w:p>
                         <w:pPr>
                           <w:pStyle w:val="Niveau"/>
-                          <w:rPr>
-                            <w:color w:val="000000" w:themeColor="text1"/>
-                          </w:rPr>
+                          <w:keepLines/>
                           <w:tabs>
                             <w:tab w:val="clear" w:pos="134.70pt"/>
                             <w:tab w:val="end" w:pos="163.05pt"/>
                           </w:tabs>
-                          <w:keepLines/>
+                          <w:rPr>
+                            <w:color w:val="000000" w:themeColor="text1"/>
+                          </w:rPr>
                         </w:pPr>
                         <w:r>
                           <w:rPr>
@@ -1567,23 +1782,33 @@
                         <w:r>
                           <w:rPr>
                             <w:rStyle w:val="Cerios-niveau"/>
+                            <w:noProof/>
                             <w:color w:val="55DD94"/>
+                          </w:rPr>
+                          <w:tab/>
+                        </w:r>
+                        <w:r>
+                          <w:rPr>
+                            <w:rStyle w:val="Cerios-niveau"/>
                             <w:noProof/>
-                          </w:rPr>
-                          <w:tab/>
+                            <w:color w:val="55DD94"/>
+                          </w:rPr>
                           <w:t></w:t>
                         </w:r>
                       </w:p>
-                      <w:br/>
                       <w:p>
                         <w:pPr>
                           <w:pStyle w:val="BasicParagraph"/>
                           <w:spacing w:line="13.80pt" w:lineRule="auto"/>
                         </w:pPr>
                         <w:r>
+                          <w:br/>
+                        </w:r>
+                        <w:r>
                           <w:rPr>
                             <w:rStyle w:val="A1"/>
                             <w:noProof/>
+                            <w:lang w:val="nl-NL"/>
                           </w:rPr>
                           <w:t>Methodes</w:t>
                         </w:r>
@@ -1591,15 +1816,15 @@
                       <w:p>
                         <w:pPr>
                           <w:pStyle w:val="Niveau"/>
-                          <w:rPr>
-                            <w:color w:val="000000" w:themeColor="text1"/>
-                          </w:rPr>
+                          <w:keepNext/>
+                          <w:keepLines/>
                           <w:tabs>
                             <w:tab w:val="clear" w:pos="134.70pt"/>
                             <w:tab w:val="end" w:pos="163.05pt"/>
                           </w:tabs>
-                          <w:keepLines/>
-                          <w:keepNext/>
+                          <w:rPr>
+                            <w:color w:val="000000" w:themeColor="text1"/>
+                          </w:rPr>
                         </w:pPr>
                         <w:r>
                           <w:rPr>
@@ -1611,24 +1836,47 @@
                         <w:r>
                           <w:rPr>
                             <w:rStyle w:val="Cerios-niveau"/>
+                            <w:noProof/>
                             <w:color w:val="55DD94"/>
+                          </w:rPr>
+                          <w:tab/>
+                        </w:r>
+                        <w:r>
+                          <w:rPr>
+                            <w:rStyle w:val="Cerios-niveau"/>
                             <w:noProof/>
-                          </w:rPr>
-                          <w:tab/>
-                          <w:t></w:t>
+                            <w:color w:val="55DD94"/>
+                          </w:rPr>
+                          <w:t></w:t>
+                        </w:r>
+                        <w:r>
+                          <w:rPr>
+                            <w:rStyle w:val="Cerios-niveau"/>
+                            <w:noProof/>
+                            <w:color w:val="55DD94"/>
+                          </w:rPr>
+                          <w:t></w:t>
+                        </w:r>
+                        <w:r>
+                          <w:rPr>
+                            <w:rStyle w:val="Cerios-niveau"/>
+                            <w:noProof/>
+                            <w:color w:val="55DD94"/>
+                          </w:rPr>
+                          <w:t></w:t>
                         </w:r>
                       </w:p>
                       <w:p>
                         <w:pPr>
                           <w:pStyle w:val="Niveau"/>
-                          <w:rPr>
-                            <w:color w:val="000000" w:themeColor="text1"/>
-                          </w:rPr>
+                          <w:keepLines/>
                           <w:tabs>
                             <w:tab w:val="clear" w:pos="134.70pt"/>
                             <w:tab w:val="end" w:pos="163.05pt"/>
                           </w:tabs>
-                          <w:keepLines/>
+                          <w:rPr>
+                            <w:color w:val="000000" w:themeColor="text1"/>
+                          </w:rPr>
                         </w:pPr>
                         <w:r>
                           <w:rPr>
@@ -1640,23 +1888,49 @@
                         <w:r>
                           <w:rPr>
                             <w:rStyle w:val="Cerios-niveau"/>
+                            <w:noProof/>
                             <w:color w:val="55DD94"/>
+                          </w:rPr>
+                          <w:tab/>
+                        </w:r>
+                        <w:r>
+                          <w:rPr>
+                            <w:rStyle w:val="Cerios-niveau"/>
                             <w:noProof/>
-                          </w:rPr>
-                          <w:tab/>
-                          <w:t></w:t>
+                            <w:color w:val="55DD94"/>
+                          </w:rPr>
+                          <w:t></w:t>
+                        </w:r>
+                        <w:r>
+                          <w:rPr>
+                            <w:rStyle w:val="Cerios-niveau"/>
+                            <w:noProof/>
+                            <w:color w:val="55DD94"/>
+                          </w:rPr>
+                          <w:t></w:t>
+                        </w:r>
+                        <w:r>
+                          <w:rPr>
+                            <w:rStyle w:val="Cerios-niveau"/>
+                            <w:noProof/>
+                            <w:color w:val="55DD94"/>
+                          </w:rPr>
+                          <w:t></w:t>
                         </w:r>
                       </w:p>
-                      <w:br/>
                       <w:p>
                         <w:pPr>
                           <w:pStyle w:val="BasicParagraph"/>
                           <w:spacing w:line="13.80pt" w:lineRule="auto"/>
                         </w:pPr>
                         <w:r>
+                          <w:br/>
+                        </w:r>
+                        <w:r>
                           <w:rPr>
                             <w:rStyle w:val="A1"/>
                             <w:noProof/>
+                            <w:lang w:val="nl-NL"/>
                           </w:rPr>
                           <w:t>OS &amp; Netwerken</w:t>
                         </w:r>
@@ -1664,14 +1938,14 @@
                       <w:p>
                         <w:pPr>
                           <w:pStyle w:val="Niveau"/>
-                          <w:rPr>
-                            <w:color w:val="000000" w:themeColor="text1"/>
-                          </w:rPr>
+                          <w:keepLines/>
                           <w:tabs>
                             <w:tab w:val="clear" w:pos="134.70pt"/>
                             <w:tab w:val="end" w:pos="163.05pt"/>
                           </w:tabs>
-                          <w:keepLines/>
+                          <w:rPr>
+                            <w:color w:val="000000" w:themeColor="text1"/>
+                          </w:rPr>
                         </w:pPr>
                         <w:r>
                           <w:rPr>
@@ -1683,14 +1957,33 @@
                         <w:r>
                           <w:rPr>
                             <w:rStyle w:val="Cerios-niveau"/>
+                            <w:noProof/>
                             <w:color w:val="55DD94"/>
+                          </w:rPr>
+                          <w:tab/>
+                        </w:r>
+                        <w:r>
+                          <w:rPr>
+                            <w:rStyle w:val="Cerios-niveau"/>
                             <w:noProof/>
-                          </w:rPr>
-                          <w:tab/>
-                          <w:t></w:t>
+                            <w:color w:val="55DD94"/>
+                          </w:rPr>
+                          <w:t></w:t>
+                        </w:r>
+                        <w:r>
+                          <w:rPr>
+                            <w:rStyle w:val="Cerios-niveau"/>
+                            <w:noProof/>
+                            <w:color w:val="55DD94"/>
+                          </w:rPr>
+                          <w:t></w:t>
                         </w:r>
                       </w:p>
-                      <w:br/>
+                      <w:p>
+                        <w:r>
+                          <w:br/>
+                        </w:r>
+                      </w:p>
                     </wne:txbxContent>
                   </wp:txbx>
                   <wp:bodyPr rot="0" spcFirstLastPara="0" vertOverflow="overflow" horzOverflow="overflow" vert="horz" wrap="square" lIns="91440" tIns="45720" rIns="91440" bIns="45720" numCol="1" spcCol="0" rtlCol="0" fromWordArt="0" anchor="t" anchorCtr="0" forceAA="0" compatLnSpc="1">
@@ -1716,7 +2009,7 @@
           <w:noProof/>
         </w:rPr>
         <w:drawing>
-          <wp:anchor distT="0" distB="0" distL="114300" distR="114300" simplePos="0" relativeHeight="251685888" behindDoc="0" locked="0" layoutInCell="1" allowOverlap="1" wp14:anchorId="215EC998" wp14:editId="39E139D8">
+          <wp:anchor distT="0" distB="0" distL="114300" distR="114300" simplePos="0" relativeHeight="251660288" behindDoc="0" locked="0" layoutInCell="1" allowOverlap="1" wp14:anchorId="215EC998" wp14:editId="39E139D8">
             <wp:simplePos x="0" y="0"/>
             <wp:positionH relativeFrom="column">
               <wp:posOffset>2219250</wp:posOffset>
@@ -1752,6 +2045,9 @@
                         <w:pPr>
                           <w:pStyle w:val="BasicParagraph"/>
                           <w:spacing w:line="13.80pt" w:lineRule="auto"/>
+                          <w:rPr>
+                            <w:lang w:val="en-US"/>
+                          </w:rPr>
                         </w:pPr>
                         <w:r>
                           <w:rPr>
@@ -1764,68 +2060,120 @@
                       <w:p>
                         <w:pPr>
                           <w:pStyle w:val="Niveau"/>
-                          <w:rPr>
-                            <w:color w:val="000000" w:themeColor="text1"/>
-                          </w:rPr>
+                          <w:keepNext/>
+                          <w:keepLines/>
                           <w:tabs>
                             <w:tab w:val="clear" w:pos="134.70pt"/>
                             <w:tab w:val="end" w:pos="163.05pt"/>
                           </w:tabs>
-                          <w:keepLines/>
-                          <w:keepNext/>
+                          <w:rPr>
+                            <w:color w:val="000000" w:themeColor="text1"/>
+                            <w:lang w:val="en-US"/>
+                          </w:rPr>
                         </w:pPr>
                         <w:r>
                           <w:rPr>
                             <w:rFonts w:ascii="Plus Jakarta Sans" w:hAnsi="Plus Jakarta Sans" w:cs="Plus Jakarta Sans"/>
                             <w:color w:val="212B46"/>
+                            <w:lang w:val="en-US"/>
                           </w:rPr>
                           <w:t>Confluence</w:t>
                         </w:r>
                         <w:r>
                           <w:rPr>
                             <w:rStyle w:val="Cerios-niveau"/>
+                            <w:noProof/>
                             <w:color w:val="55DD94"/>
+                            <w:lang w:val="en-US"/>
+                          </w:rPr>
+                          <w:tab/>
+                        </w:r>
+                        <w:r>
+                          <w:rPr>
+                            <w:rStyle w:val="Cerios-niveau"/>
                             <w:noProof/>
-                          </w:rPr>
-                          <w:tab/>
-                          <w:t></w:t>
+                            <w:color w:val="55DD94"/>
+                          </w:rPr>
+                          <w:t></w:t>
+                        </w:r>
+                        <w:r>
+                          <w:rPr>
+                            <w:rStyle w:val="Cerios-niveau"/>
+                            <w:noProof/>
+                            <w:color w:val="55DD94"/>
+                          </w:rPr>
+                          <w:t></w:t>
+                        </w:r>
+                        <w:r>
+                          <w:rPr>
+                            <w:rStyle w:val="Cerios-niveau"/>
+                            <w:noProof/>
+                            <w:color w:val="55DD94"/>
+                          </w:rPr>
+                          <w:t></w:t>
                         </w:r>
                       </w:p>
                       <w:p>
                         <w:pPr>
                           <w:pStyle w:val="Niveau"/>
-                          <w:rPr>
-                            <w:color w:val="000000" w:themeColor="text1"/>
-                          </w:rPr>
+                          <w:keepLines/>
                           <w:tabs>
                             <w:tab w:val="clear" w:pos="134.70pt"/>
                             <w:tab w:val="end" w:pos="163.05pt"/>
                           </w:tabs>
-                          <w:keepLines/>
+                          <w:rPr>
+                            <w:color w:val="000000" w:themeColor="text1"/>
+                            <w:lang w:val="en-US"/>
+                          </w:rPr>
                         </w:pPr>
                         <w:r>
                           <w:rPr>
                             <w:rFonts w:ascii="Plus Jakarta Sans" w:hAnsi="Plus Jakarta Sans" w:cs="Plus Jakarta Sans"/>
                             <w:color w:val="212B46"/>
+                            <w:lang w:val="en-US"/>
                           </w:rPr>
                           <w:t>Azure DevOps</w:t>
                         </w:r>
                         <w:r>
                           <w:rPr>
                             <w:rStyle w:val="Cerios-niveau"/>
+                            <w:noProof/>
                             <w:color w:val="55DD94"/>
+                            <w:lang w:val="en-US"/>
+                          </w:rPr>
+                          <w:tab/>
+                        </w:r>
+                        <w:r>
+                          <w:rPr>
+                            <w:rStyle w:val="Cerios-niveau"/>
                             <w:noProof/>
-                          </w:rPr>
-                          <w:tab/>
-                          <w:t></w:t>
+                            <w:color w:val="55DD94"/>
+                          </w:rPr>
+                          <w:t></w:t>
+                        </w:r>
+                        <w:r>
+                          <w:rPr>
+                            <w:rStyle w:val="Cerios-niveau"/>
+                            <w:noProof/>
+                            <w:color w:val="55DD94"/>
+                          </w:rPr>
+                          <w:t></w:t>
                         </w:r>
                       </w:p>
-                      <w:br/>
                       <w:p>
                         <w:pPr>
                           <w:pStyle w:val="BasicParagraph"/>
                           <w:spacing w:line="13.80pt" w:lineRule="auto"/>
+                          <w:rPr>
+                            <w:lang w:val="en-US"/>
+                          </w:rPr>
                         </w:pPr>
+                        <w:r>
+                          <w:rPr>
+                            <w:lang w:val="en-US"/>
+                          </w:rPr>
+                          <w:br/>
+                        </w:r>
                         <w:r>
                           <w:rPr>
                             <w:rStyle w:val="A1"/>
@@ -1837,33 +2185,63 @@
                       <w:p>
                         <w:pPr>
                           <w:pStyle w:val="Niveau"/>
-                          <w:rPr>
-                            <w:color w:val="000000" w:themeColor="text1"/>
-                          </w:rPr>
+                          <w:keepLines/>
                           <w:tabs>
                             <w:tab w:val="clear" w:pos="134.70pt"/>
                             <w:tab w:val="end" w:pos="163.05pt"/>
                           </w:tabs>
-                          <w:keepLines/>
+                          <w:rPr>
+                            <w:color w:val="000000" w:themeColor="text1"/>
+                            <w:lang w:val="en-US"/>
+                          </w:rPr>
                         </w:pPr>
                         <w:r>
                           <w:rPr>
                             <w:rFonts w:ascii="Plus Jakarta Sans" w:hAnsi="Plus Jakarta Sans" w:cs="Plus Jakarta Sans"/>
                             <w:color w:val="212B46"/>
+                            <w:lang w:val="en-US"/>
                           </w:rPr>
                           <w:t>Selenium</w:t>
                         </w:r>
                         <w:r>
                           <w:rPr>
                             <w:rStyle w:val="Cerios-niveau"/>
+                            <w:noProof/>
                             <w:color w:val="55DD94"/>
+                            <w:lang w:val="en-US"/>
+                          </w:rPr>
+                          <w:tab/>
+                        </w:r>
+                        <w:r>
+                          <w:rPr>
+                            <w:rStyle w:val="Cerios-niveau"/>
                             <w:noProof/>
-                          </w:rPr>
-                          <w:tab/>
-                          <w:t></w:t>
+                            <w:color w:val="55DD94"/>
+                          </w:rPr>
+                          <w:t></w:t>
+                        </w:r>
+                        <w:r>
+                          <w:rPr>
+                            <w:rStyle w:val="Cerios-niveau"/>
+                            <w:noProof/>
+                            <w:color w:val="55DD94"/>
+                          </w:rPr>
+                          <w:t></w:t>
                         </w:r>
                       </w:p>
-                      <w:br/>
+                      <w:p>
+                        <w:pPr>
+                          <w:rPr>
+                            <w:lang w:val="en-US"/>
+                          </w:rPr>
+                        </w:pPr>
+                        <w:r>
+                          <w:rPr>
+                            <w:lang w:val="en-US"/>
+                          </w:rPr>
+                          <w:br/>
+                        </w:r>
+                      </w:p>
                     </wne:txbxContent>
                   </wp:txbx>
                   <wp:bodyPr rot="0" spcFirstLastPara="0" vertOverflow="overflow" horzOverflow="overflow" vert="horz" wrap="square" lIns="91440" tIns="45720" rIns="91440" bIns="45720" numCol="1" spcCol="0" rtlCol="0" fromWordArt="0" anchor="t" anchorCtr="0" forceAA="0" compatLnSpc="1">
@@ -1889,7 +2267,7 @@
           <w:noProof/>
         </w:rPr>
         <w:drawing>
-          <wp:anchor distT="0" distB="0" distL="114300" distR="114300" simplePos="0" relativeHeight="251661312" behindDoc="0" locked="0" layoutInCell="1" allowOverlap="1" wp14:anchorId="7FC684E5" wp14:editId="2217D624">
+          <wp:anchor distT="0" distB="0" distL="114300" distR="114300" simplePos="0" relativeHeight="251649024" behindDoc="0" locked="0" layoutInCell="1" allowOverlap="1" wp14:anchorId="7FC684E5" wp14:editId="2217D624">
             <wp:simplePos x="0" y="0"/>
             <wp:positionH relativeFrom="column">
               <wp:posOffset>1812290</wp:posOffset>
@@ -1951,6 +2329,13 @@
                             <w:szCs w:val="18"/>
                           </w:rPr>
                           <w:t>basis</w:t>
+                        </w:r>
+                        <w:r>
+                          <w:rPr>
+                            <w:color w:val="212B46"/>
+                            <w:sz w:val="18"/>
+                            <w:szCs w:val="18"/>
+                          </w:rPr>
                           <w:tab/>
                         </w:r>
                         <w:r>
@@ -1960,16 +2345,7 @@
                             <w:sz w:val="18"/>
                             <w:szCs w:val="18"/>
                           </w:rPr>
-                          <w:t xml:space="preserve"> </w:t>
-                        </w:r>
-                        <w:r>
-                          <w:rPr>
-                            <w:color w:val="212B46"/>
-                            <w:sz w:val="18"/>
-                            <w:szCs w:val="18"/>
-                          </w:rPr>
-                          <w:t>gevorderd</w:t>
-                          <w:tab/>
+                          <w:t></w:t>
                         </w:r>
                         <w:r>
                           <w:rPr>
@@ -1978,7 +2354,50 @@
                             <w:sz w:val="18"/>
                             <w:szCs w:val="18"/>
                           </w:rPr>
-                          <w:t xml:space="preserve"> </w:t>
+                          <w:t xml:space="preserve"> </w:t>
+                        </w:r>
+                        <w:r>
+                          <w:rPr>
+                            <w:color w:val="212B46"/>
+                            <w:sz w:val="18"/>
+                            <w:szCs w:val="18"/>
+                          </w:rPr>
+                          <w:t>gevorderd</w:t>
+                        </w:r>
+                        <w:r>
+                          <w:rPr>
+                            <w:color w:val="212B46"/>
+                            <w:sz w:val="18"/>
+                            <w:szCs w:val="18"/>
+                          </w:rPr>
+                          <w:tab/>
+                        </w:r>
+                        <w:r>
+                          <w:rPr>
+                            <w:rStyle w:val="Cerios-niveau"/>
+                            <w:color w:val="55DD94"/>
+                            <w:sz w:val="18"/>
+                            <w:szCs w:val="18"/>
+                          </w:rPr>
+                          <w:t></w:t>
+                        </w:r>
+                        <w:r>
+                          <w:rPr>
+                            <w:rStyle w:val="Cerios-niveau"/>
+                            <w:color w:val="55DD94"/>
+                            <w:sz w:val="18"/>
+                            <w:szCs w:val="18"/>
+                          </w:rPr>
+                          <w:t></w:t>
+                        </w:r>
+                        <w:r>
+                          <w:rPr>
+                            <w:rStyle w:val="Cerios-niveau"/>
+                            <w:color w:val="55DD94"/>
+                            <w:sz w:val="18"/>
+                            <w:szCs w:val="18"/>
+                          </w:rPr>
+                          <w:t xml:space="preserve"> </w:t>
                         </w:r>
                         <w:r>
                           <w:rPr>
@@ -2008,13 +2427,6 @@
       </w:r>
     </w:p>
     <w:p>
-      <w:sectPr>
-        <w:type w:val="continuous"/>
-        <w:pgSz w:w="595.30pt" w:h="841.90pt"/>
-        <w:pgMar w:top="72pt" w:right="26.95pt" w:bottom="72pt" w:left="36.55pt" w:header="35.45pt" w:footer="2.85pt" w:gutter="0pt"/>
-        <w:cols w:space="17.45pt"/>
-        <w:docGrid w:linePitch="360"/>
-      </w:sectPr>
       <w:r>
         <w:br w:type="page"/>
       </w:r>
@@ -2023,10 +2435,13 @@
       <w:pPr>
         <w:pStyle w:val="Titel1"/>
       </w:pPr>
-      <w:keepNext/>
       <w:r>
+        <w:rPr>
+          <w:noProof/>
+        </w:rPr>
+        <w:lastRenderedPageBreak/>
         <w:drawing>
-          <wp:anchor distT="0" distB="0" distL="114300" distR="114300" simplePos="0" relativeHeight="251694080" behindDoc="0" locked="0" layoutInCell="1" allowOverlap="1" wp14:anchorId="2227511B" wp14:editId="5456FB9C">
+          <wp:anchor distT="0" distB="0" distL="114300" distR="114300" simplePos="0" relativeHeight="251664384" behindDoc="0" locked="0" layoutInCell="1" allowOverlap="1" wp14:anchorId="2227511B" wp14:editId="5456FB9C">
             <wp:simplePos x="0" y="0"/>
             <wp:positionH relativeFrom="column">
               <wp:posOffset>-635</wp:posOffset>
@@ -2086,8 +2501,14 @@
       </w:r>
       <w:r>
         <w:t>Opleidingen &amp; trainingen</w:t>
+      </w:r>
+      <w:r>
         <w:br/>
+      </w:r>
+      <w:r>
         <w:br/>
+      </w:r>
+      <w:r>
         <w:br/>
       </w:r>
     </w:p>
@@ -2183,7 +2604,7 @@
           </w:p>
         </w:tc>
       </w:tr>
-      <w:tr xmlns:a="http://purl.oclc.org/ooxml/drawingml/main">
+      <w:tr>
         <w:trPr>
           <w:trHeight w:val="14"/>
         </w:trPr>
@@ -2199,10 +2620,14 @@
             <w:pPr>
               <w:pStyle w:val="BasicParagraph"/>
               <w:keepLines/>
+              <w:rPr>
+                <w:color w:val="212B46"/>
+              </w:rPr>
             </w:pPr>
             <w:r>
               <w:rPr>
                 <w:rFonts w:ascii="Plus Jakarta Sans" w:hAnsi="Plus Jakarta Sans"/>
+                <w:color w:val="212B46"/>
                 <w:sz w:val="18"/>
                 <w:szCs w:val="16"/>
               </w:rPr>
@@ -2221,10 +2646,14 @@
           <w:p>
             <w:pPr>
               <w:pStyle w:val="BasicParagraph"/>
+              <w:rPr>
+                <w:color w:val="212B46"/>
+              </w:rPr>
             </w:pPr>
             <w:r>
               <w:rPr>
                 <w:rFonts w:ascii="Plus Jakarta Sans" w:hAnsi="Plus Jakarta Sans"/>
+                <w:color w:val="212B46"/>
                 <w:sz w:val="18"/>
                 <w:szCs w:val="16"/>
               </w:rPr>
@@ -2243,10 +2672,14 @@
           <w:p>
             <w:pPr>
               <w:pStyle w:val="BasicParagraph"/>
+              <w:rPr>
+                <w:color w:val="212B46"/>
+              </w:rPr>
             </w:pPr>
             <w:r>
               <w:rPr>
                 <w:rFonts w:ascii="Plus Jakarta Sans" w:hAnsi="Plus Jakarta Sans"/>
+                <w:color w:val="212B46"/>
                 <w:sz w:val="18"/>
                 <w:szCs w:val="16"/>
               </w:rPr>
@@ -2265,19 +2698,25 @@
           <w:p>
             <w:pPr>
               <w:pStyle w:val="BasicParagraph"/>
+              <w:rPr>
+                <w:color w:val="212B46"/>
+              </w:rPr>
             </w:pPr>
+            <w:proofErr w:type="gramStart"/>
             <w:r>
               <w:rPr>
                 <w:rFonts w:ascii="Plus Jakarta Sans" w:hAnsi="Plus Jakarta Sans"/>
+                <w:color w:val="212B46"/>
                 <w:sz w:val="18"/>
                 <w:szCs w:val="16"/>
               </w:rPr>
               <w:t>nee</w:t>
             </w:r>
+            <w:proofErr w:type="gramEnd"/>
           </w:p>
         </w:tc>
       </w:tr>
-      <w:tr xmlns:a="http://purl.oclc.org/ooxml/drawingml/main">
+      <w:tr>
         <w:trPr>
           <w:trHeight w:val="14"/>
         </w:trPr>
@@ -2293,10 +2732,14 @@
             <w:pPr>
               <w:pStyle w:val="BasicParagraph"/>
               <w:keepLines/>
+              <w:rPr>
+                <w:color w:val="212B46"/>
+              </w:rPr>
             </w:pPr>
             <w:r>
               <w:rPr>
                 <w:rFonts w:ascii="Plus Jakarta Sans" w:hAnsi="Plus Jakarta Sans"/>
+                <w:color w:val="212B46"/>
                 <w:sz w:val="18"/>
                 <w:szCs w:val="16"/>
               </w:rPr>
@@ -2315,10 +2758,14 @@
           <w:p>
             <w:pPr>
               <w:pStyle w:val="BasicParagraph"/>
+              <w:rPr>
+                <w:color w:val="212B46"/>
+              </w:rPr>
             </w:pPr>
             <w:r>
               <w:rPr>
                 <w:rFonts w:ascii="Plus Jakarta Sans" w:hAnsi="Plus Jakarta Sans"/>
+                <w:color w:val="212B46"/>
                 <w:sz w:val="18"/>
                 <w:szCs w:val="16"/>
               </w:rPr>
@@ -2337,10 +2784,14 @@
           <w:p>
             <w:pPr>
               <w:pStyle w:val="BasicParagraph"/>
+              <w:rPr>
+                <w:color w:val="212B46"/>
+              </w:rPr>
             </w:pPr>
             <w:r>
               <w:rPr>
                 <w:rFonts w:ascii="Plus Jakarta Sans" w:hAnsi="Plus Jakarta Sans"/>
+                <w:color w:val="212B46"/>
                 <w:sz w:val="18"/>
                 <w:szCs w:val="16"/>
               </w:rPr>
@@ -2359,15 +2810,21 @@
           <w:p>
             <w:pPr>
               <w:pStyle w:val="BasicParagraph"/>
+              <w:rPr>
+                <w:color w:val="212B46"/>
+              </w:rPr>
             </w:pPr>
+            <w:proofErr w:type="gramStart"/>
             <w:r>
               <w:rPr>
                 <w:rFonts w:ascii="Plus Jakarta Sans" w:hAnsi="Plus Jakarta Sans"/>
+                <w:color w:val="212B46"/>
                 <w:sz w:val="18"/>
                 <w:szCs w:val="16"/>
               </w:rPr>
               <w:t>ja</w:t>
             </w:r>
+            <w:proofErr w:type="gramEnd"/>
           </w:p>
         </w:tc>
       </w:tr>
@@ -2509,7 +2966,7 @@
           </w:p>
         </w:tc>
       </w:tr>
-      <w:tr xmlns:a="http://purl.oclc.org/ooxml/drawingml/main">
+      <w:tr>
         <w:trPr>
           <w:trHeight w:val="14"/>
         </w:trPr>
@@ -2525,9 +2982,13 @@
             <w:pPr>
               <w:pStyle w:val="Pa0"/>
               <w:keepLines/>
+              <w:rPr>
+                <w:color w:val="212B46"/>
+              </w:rPr>
             </w:pPr>
             <w:r>
               <w:rPr>
+                <w:color w:val="212B46"/>
                 <w:sz w:val="18"/>
                 <w:szCs w:val="18"/>
               </w:rPr>
@@ -2546,9 +3007,13 @@
           <w:p>
             <w:pPr>
               <w:pStyle w:val="Pa0"/>
+              <w:rPr>
+                <w:color w:val="212B46"/>
+              </w:rPr>
             </w:pPr>
             <w:r>
               <w:rPr>
+                <w:color w:val="212B46"/>
                 <w:sz w:val="18"/>
                 <w:szCs w:val="18"/>
               </w:rPr>
@@ -2565,10 +3030,15 @@
             <w:vAlign w:val="center"/>
           </w:tcPr>
           <w:p>
-            <w:pPr/>
+            <w:pPr>
+              <w:rPr>
+                <w:color w:val="212B46"/>
+              </w:rPr>
+            </w:pPr>
             <w:r>
               <w:rPr>
                 <w:rFonts w:ascii="Plus Jakarta Sans" w:hAnsi="Plus Jakarta Sans"/>
+                <w:color w:val="212B46"/>
                 <w:sz w:val="18"/>
                 <w:szCs w:val="18"/>
               </w:rPr>
@@ -2584,9 +3054,15 @@
             </w:tcBorders>
           </w:tcPr>
           <w:p>
+            <w:pPr>
+              <w:rPr>
+                <w:color w:val="212B46"/>
+              </w:rPr>
+            </w:pPr>
             <w:r>
               <w:rPr>
                 <w:rFonts w:ascii="Plus Jakarta Sans" w:hAnsi="Plus Jakarta Sans"/>
+                <w:color w:val="212B46"/>
                 <w:sz w:val="18"/>
                 <w:szCs w:val="18"/>
               </w:rPr>
@@ -2595,7 +3071,7 @@
           </w:p>
         </w:tc>
       </w:tr>
-      <w:tr xmlns:a="http://purl.oclc.org/ooxml/drawingml/main">
+      <w:tr>
         <w:trPr>
           <w:trHeight w:val="14"/>
         </w:trPr>
@@ -2611,9 +3087,13 @@
             <w:pPr>
               <w:pStyle w:val="Pa0"/>
               <w:keepLines/>
+              <w:rPr>
+                <w:color w:val="212B46"/>
+              </w:rPr>
             </w:pPr>
             <w:r>
               <w:rPr>
+                <w:color w:val="212B46"/>
                 <w:sz w:val="18"/>
                 <w:szCs w:val="18"/>
               </w:rPr>
@@ -2632,9 +3112,13 @@
           <w:p>
             <w:pPr>
               <w:pStyle w:val="Pa0"/>
+              <w:rPr>
+                <w:color w:val="212B46"/>
+              </w:rPr>
             </w:pPr>
             <w:r>
               <w:rPr>
+                <w:color w:val="212B46"/>
                 <w:sz w:val="18"/>
                 <w:szCs w:val="18"/>
               </w:rPr>
@@ -2651,10 +3135,15 @@
             <w:vAlign w:val="center"/>
           </w:tcPr>
           <w:p>
-            <w:pPr/>
+            <w:pPr>
+              <w:rPr>
+                <w:color w:val="212B46"/>
+              </w:rPr>
+            </w:pPr>
             <w:r>
               <w:rPr>
                 <w:rFonts w:ascii="Plus Jakarta Sans" w:hAnsi="Plus Jakarta Sans"/>
+                <w:color w:val="212B46"/>
                 <w:sz w:val="18"/>
                 <w:szCs w:val="18"/>
               </w:rPr>
@@ -2670,9 +3159,15 @@
             </w:tcBorders>
           </w:tcPr>
           <w:p>
+            <w:pPr>
+              <w:rPr>
+                <w:color w:val="212B46"/>
+              </w:rPr>
+            </w:pPr>
             <w:r>
               <w:rPr>
                 <w:rFonts w:ascii="Plus Jakarta Sans" w:hAnsi="Plus Jakarta Sans"/>
+                <w:color w:val="212B46"/>
                 <w:sz w:val="18"/>
                 <w:szCs w:val="18"/>
               </w:rPr>
@@ -2697,7 +3192,6 @@
       <w:pPr>
         <w:pStyle w:val="Titel1"/>
       </w:pPr>
-      <w:keepNext/>
       <w:r>
         <w:t>Werkervaring</w:t>
       </w:r>
@@ -2707,8 +3201,11 @@
         <w:pStyle w:val="Titel1"/>
       </w:pPr>
       <w:r>
+        <w:rPr>
+          <w:noProof/>
+        </w:rPr>
         <w:drawing>
-          <wp:anchor distT="0" distB="0" distL="114300" distR="114300" simplePos="0" relativeHeight="251696128" behindDoc="0" locked="0" layoutInCell="1" allowOverlap="1" wp14:anchorId="0E3D2438" wp14:editId="7C3F9A4D">
+          <wp:anchor distT="0" distB="0" distL="114300" distR="114300" simplePos="0" relativeHeight="251665408" behindDoc="0" locked="0" layoutInCell="1" allowOverlap="1" wp14:anchorId="0E3D2438" wp14:editId="7C3F9A4D">
             <wp:simplePos x="0" y="0"/>
             <wp:positionH relativeFrom="margin">
               <wp:posOffset>-635</wp:posOffset>
@@ -2772,15 +3269,18 @@
         <w:pStyle w:val="Titel1"/>
       </w:pPr>
     </w:p>
-    <w:p xmlns:a="http://purl.oclc.org/ooxml/drawingml/main">
+    <w:p>
       <w:r>
+        <w:rPr>
+          <w:noProof/>
+        </w:rPr>
         <w:drawing>
           <wp:inline distT="0" distB="0" distL="0" distR="0" wp14:anchorId="3F6C22CD" wp14:editId="0D488227">
             <wp:extent cx="6667500" cy="3567430"/>
             <wp:effectExtent l="0" t="0" r="0" b="0"/>
             <wp:docPr id="1868590632" name="Text Box 9"/>
             <wp:cNvGraphicFramePr/>
-            <a:graphic>
+            <a:graphic xmlns:a="http://purl.oclc.org/ooxml/drawingml/main">
               <a:graphicData uri="http://schemas.microsoft.com/office/word/2010/wordprocessingShape">
                 <wp:wsp>
                   <wp:cNvSpPr txBox="1"/>
@@ -2807,8 +3307,8 @@
                         <w:pPr>
                           <w:rPr>
                             <w:rFonts w:ascii="Plus Jakarta Sans" w:hAnsi="Plus Jakarta Sans"/>
+                            <w:noProof/>
                             <w:color w:val="212B46"/>
-                            <w:noProof/>
                           </w:rPr>
                         </w:pPr>
                         <w:r>
@@ -2857,10 +3357,10 @@
                         <w:r>
                           <w:rPr>
                             <w:rFonts w:ascii="Plus Jakarta Sans" w:hAnsi="Plus Jakarta Sans"/>
+                            <w:noProof/>
                             <w:color w:val="212B46"/>
                             <w:sz w:val="18"/>
                             <w:szCs w:val="18"/>
-                            <w:noProof/>
                           </w:rPr>
                           <w:t>Rol</w:t>
                         </w:r>
@@ -2871,10 +3371,10 @@
                             <w:rFonts w:ascii="Plus Jakarta Sans" w:hAnsi="Plus Jakarta Sans"/>
                             <w:b/>
                             <w:bCs/>
+                            <w:noProof/>
                             <w:color w:val="212B46"/>
                             <w:sz w:val="22"/>
                             <w:szCs w:val="22"/>
-                            <w:noProof/>
                           </w:rPr>
                           <w:t>Situatie</w:t>
                         </w:r>
@@ -2883,69 +3383,64 @@
                         <w:pPr>
                           <w:pStyle w:val="BasicParagraph"/>
                           <w:suppressAutoHyphens/>
+                          <w:rPr>
+                            <w:rFonts w:ascii="Plus Jakarta Sans" w:hAnsi="Plus Jakarta Sans"/>
+                          </w:rPr>
                         </w:pPr>
-                        <w:proofErr w:type="spellStart"/>
-                        <w:r>
-                          <w:rPr>
-                            <w:rFonts w:ascii="PlusJakartaSans-Regular" w:hAnsi="PlusJakartaSans-Regular" w:cs="PlusJakartaSans-Regular"/>
+                        <w:r>
+                          <w:rPr>
+                            <w:rFonts w:ascii="Plus Jakarta Sans" w:hAnsi="Plus Jakarta Sans" w:cs="PlusJakartaSans-Regular"/>
                             <w:color w:val="212B46"/>
                             <w:sz w:val="18"/>
                             <w:szCs w:val="18"/>
                           </w:rPr>
-                          <w:t>Licht de klant eventueel kort toe. Wat doet de klant? Wat is de probleemstelling van de klant? </w:t>
-                        </w:r>
-                        <w:proofErr w:type="spellEnd"/>
+                          <w:t>Licht de klant eventueel kort toe. Wat doet de klant? Wat is de probleemstelling van de klant?</w:t>
+                        </w:r>
                       </w:p>
                       <w:p>
                         <w:pPr>
                           <w:pStyle w:val="BasicParagraph"/>
                           <w:suppressAutoHyphens/>
+                          <w:rPr>
+                            <w:rFonts w:ascii="Plus Jakarta Sans" w:hAnsi="Plus Jakarta Sans"/>
+                          </w:rPr>
                         </w:pPr>
-                        <w:proofErr w:type="spellStart"/>
-                        <w:r>
-                          <w:rPr>
-                            <w:rFonts w:ascii="PlusJakartaSans-Regular" w:hAnsi="PlusJakartaSans-Regular" w:cs="PlusJakartaSans-Regular"/>
+                        <w:r>
+                          <w:rPr>
+                            <w:rFonts w:ascii="Plus Jakarta Sans" w:hAnsi="Plus Jakarta Sans" w:cs="PlusJakartaSans-Regular"/>
                             <w:color w:val="212B46"/>
                             <w:sz w:val="18"/>
                             <w:szCs w:val="18"/>
                           </w:rPr>
                           <w:t>Wat was de opdracht?</w:t>
                         </w:r>
-                        <w:proofErr w:type="spellEnd"/>
                       </w:p>
                       <w:p>
                         <w:pPr>
                           <w:pStyle w:val="BasicParagraph"/>
                           <w:suppressAutoHyphens/>
+                          <w:rPr>
+                            <w:rFonts w:ascii="Plus Jakarta Sans" w:hAnsi="Plus Jakarta Sans"/>
+                          </w:rPr>
                         </w:pPr>
-                        <w:proofErr w:type="spellStart"/>
-                        <w:r>
-                          <w:rPr>
-                            <w:rFonts w:ascii="PlusJakartaSans-Regular" w:hAnsi="PlusJakartaSans-Regular" w:cs="PlusJakartaSans-Regular"/>
-                            <w:color w:val="212B46"/>
-                            <w:sz w:val="18"/>
-                            <w:szCs w:val="18"/>
-                          </w:rPr>
-                          <w:t/>
-                        </w:r>
-                        <w:proofErr w:type="spellEnd"/>
                       </w:p>
                       <w:p>
                         <w:pPr>
                           <w:pStyle w:val="BasicParagraph"/>
                           <w:suppressAutoHyphens/>
+                          <w:rPr>
+                            <w:rFonts w:ascii="Plus Jakarta Sans" w:hAnsi="Plus Jakarta Sans"/>
+                          </w:rPr>
                         </w:pPr>
-                        <w:proofErr w:type="spellStart"/>
-                        <w:r>
-                          <w:rPr>
-                            <w:rFonts w:ascii="PlusJakartaSans-Regular" w:hAnsi="PlusJakartaSans-Regular" w:cs="PlusJakartaSans-Regular"/>
+                        <w:r>
+                          <w:rPr>
+                            <w:rFonts w:ascii="Plus Jakarta Sans" w:hAnsi="Plus Jakarta Sans" w:cs="PlusJakartaSans-Regular"/>
                             <w:color w:val="212B46"/>
                             <w:sz w:val="18"/>
                             <w:szCs w:val="18"/>
                           </w:rPr>
                           <w:t>Omschrijf de opdracht kort.</w:t>
                         </w:r>
-                        <w:proofErr w:type="spellEnd"/>
                       </w:p>
                       <w:p>
                         <w:pPr>
@@ -2956,10 +3451,10 @@
                             <w:rFonts w:ascii="Plus Jakarta Sans" w:hAnsi="Plus Jakarta Sans"/>
                             <w:b/>
                             <w:bCs/>
+                            <w:noProof/>
                             <w:color w:val="212B46"/>
                             <w:sz w:val="22"/>
                             <w:szCs w:val="22"/>
-                            <w:noProof/>
                           </w:rPr>
                           <w:t>Taken</w:t>
                         </w:r>
@@ -2968,52 +3463,46 @@
                         <w:pPr>
                           <w:pStyle w:val="BasicParagraph"/>
                           <w:suppressAutoHyphens/>
+                          <w:rPr>
+                            <w:rFonts w:ascii="Plus Jakarta Sans" w:hAnsi="Plus Jakarta Sans"/>
+                          </w:rPr>
                         </w:pPr>
-                        <w:proofErr w:type="spellStart"/>
-                        <w:r>
-                          <w:rPr>
-                            <w:rFonts w:ascii="PlusJakartaSans-Regular" w:hAnsi="PlusJakartaSans-Regular" w:cs="PlusJakartaSans-Regular"/>
+                        <w:r>
+                          <w:rPr>
+                            <w:rFonts w:ascii="Plus Jakarta Sans" w:hAnsi="Plus Jakarta Sans" w:cs="PlusJakartaSans-Regular"/>
                             <w:color w:val="212B46"/>
                             <w:sz w:val="18"/>
                             <w:szCs w:val="18"/>
                           </w:rPr>
                           <w:t>Beschrijf hier 1 à 2 van de belangrijkste werkzaamheden van de opdracht. Wat heb je gedaan en hoe?</w:t>
                         </w:r>
-                        <w:proofErr w:type="spellEnd"/>
                       </w:p>
                       <w:p>
                         <w:pPr>
                           <w:pStyle w:val="BasicParagraph"/>
                           <w:suppressAutoHyphens/>
+                          <w:rPr>
+                            <w:rFonts w:ascii="Plus Jakarta Sans" w:hAnsi="Plus Jakarta Sans"/>
+                          </w:rPr>
                         </w:pPr>
-                        <w:proofErr w:type="spellStart"/>
-                        <w:r>
-                          <w:rPr>
-                            <w:rFonts w:ascii="PlusJakartaSans-Regular" w:hAnsi="PlusJakartaSans-Regular" w:cs="PlusJakartaSans-Regular"/>
-                            <w:color w:val="212B46"/>
-                            <w:sz w:val="18"/>
-                            <w:szCs w:val="18"/>
-                          </w:rPr>
-                          <w:t/>
-                        </w:r>
-                        <w:proofErr w:type="spellEnd"/>
                       </w:p>
                       <w:p>
                         <w:pPr>
                           <w:pStyle w:val="BasicParagraph"/>
                           <w:suppressAutoHyphens/>
+                          <w:rPr>
+                            <w:rFonts w:ascii="Plus Jakarta Sans" w:hAnsi="Plus Jakarta Sans"/>
+                          </w:rPr>
                         </w:pPr>
-                        <w:proofErr w:type="spellStart"/>
-                        <w:r>
-                          <w:rPr>
-                            <w:rFonts w:ascii="PlusJakartaSans-Regular" w:hAnsi="PlusJakartaSans-Regular" w:cs="PlusJakartaSans-Regular"/>
+                        <w:r>
+                          <w:rPr>
+                            <w:rFonts w:ascii="Plus Jakarta Sans" w:hAnsi="Plus Jakarta Sans" w:cs="PlusJakartaSans-Regular"/>
                             <w:color w:val="212B46"/>
                             <w:sz w:val="18"/>
                             <w:szCs w:val="18"/>
                           </w:rPr>
                           <w:t>Overige activiteiten:</w:t>
                         </w:r>
-                        <w:proofErr w:type="spellEnd"/>
                       </w:p>
                       <w:p>
                         <w:pPr>
@@ -3022,8 +3511,10 @@
                             <w:ilvl w:val="0"/>
                             <w:numId w:val="7"/>
                           </w:numPr>
+                          <w:rPr>
+                            <w:rFonts w:ascii="Plus Jakarta Sans" w:hAnsi="Plus Jakarta Sans"/>
+                          </w:rPr>
                         </w:pPr>
-                        <w:proofErr w:type="spellStart"/>
                         <w:r>
                           <w:rPr>
                             <w:rFonts w:ascii="Plus Jakarta Sans" w:hAnsi="Plus Jakarta Sans"/>
@@ -3033,7 +3524,6 @@
                           </w:rPr>
                           <w:t>De andere werkzaamheden tijdens de opdracht</w:t>
                         </w:r>
-                        <w:proofErr w:type="spellEnd"/>
                       </w:p>
                       <w:p>
                         <w:pPr>
@@ -3042,8 +3532,10 @@
                             <w:ilvl w:val="0"/>
                             <w:numId w:val="7"/>
                           </w:numPr>
+                          <w:rPr>
+                            <w:rFonts w:ascii="Plus Jakarta Sans" w:hAnsi="Plus Jakarta Sans"/>
+                          </w:rPr>
                         </w:pPr>
-                        <w:proofErr w:type="spellStart"/>
                         <w:r>
                           <w:rPr>
                             <w:rFonts w:ascii="Plus Jakarta Sans" w:hAnsi="Plus Jakarta Sans"/>
@@ -3053,7 +3545,6 @@
                           </w:rPr>
                           <w:t>De andere werkzaamheden tijdens de opdracht</w:t>
                         </w:r>
-                        <w:proofErr w:type="spellEnd"/>
                       </w:p>
                       <w:p>
                         <w:pPr>
@@ -3064,10 +3555,10 @@
                             <w:rFonts w:ascii="Plus Jakarta Sans" w:hAnsi="Plus Jakarta Sans"/>
                             <w:b/>
                             <w:bCs/>
+                            <w:noProof/>
                             <w:color w:val="212B46"/>
                             <w:sz w:val="22"/>
                             <w:szCs w:val="22"/>
-                            <w:noProof/>
                           </w:rPr>
                           <w:t>Resultaten</w:t>
                         </w:r>
@@ -3076,18 +3567,19 @@
                         <w:pPr>
                           <w:pStyle w:val="BasicParagraph"/>
                           <w:suppressAutoHyphens/>
+                          <w:rPr>
+                            <w:rFonts w:ascii="Plus Jakarta Sans" w:hAnsi="Plus Jakarta Sans"/>
+                          </w:rPr>
                         </w:pPr>
-                        <w:proofErr w:type="spellStart"/>
-                        <w:r>
-                          <w:rPr>
-                            <w:rFonts w:ascii="PlusJakartaSans-Regular" w:hAnsi="PlusJakartaSans-Regular" w:cs="PlusJakartaSans-Regular"/>
+                        <w:r>
+                          <w:rPr>
+                            <w:rFonts w:ascii="Plus Jakarta Sans" w:hAnsi="Plus Jakarta Sans" w:cs="PlusJakartaSans-Regular"/>
                             <w:color w:val="212B46"/>
                             <w:sz w:val="18"/>
                             <w:szCs w:val="18"/>
                           </w:rPr>
                           <w:t>Wat was het resultaat van de (1 à 2 belangrijkste) werkzaamheden?</w:t>
                         </w:r>
-                        <w:proofErr w:type="spellEnd"/>
                       </w:p>
                       <w:p>
                         <w:pPr>
@@ -3096,8 +3588,10 @@
                             <w:ilvl w:val="0"/>
                             <w:numId w:val="7"/>
                           </w:numPr>
+                          <w:rPr>
+                            <w:rFonts w:ascii="Plus Jakarta Sans" w:hAnsi="Plus Jakarta Sans"/>
+                          </w:rPr>
                         </w:pPr>
-                        <w:proofErr w:type="spellStart"/>
                         <w:r>
                           <w:rPr>
                             <w:rFonts w:ascii="Plus Jakarta Sans" w:hAnsi="Plus Jakarta Sans"/>
@@ -3107,7 +3601,6 @@
                           </w:rPr>
                           <w:t>Overige resultaten</w:t>
                         </w:r>
-                        <w:proofErr w:type="spellEnd"/>
                       </w:p>
                       <w:p>
                         <w:pPr>
@@ -3116,8 +3609,10 @@
                             <w:ilvl w:val="0"/>
                             <w:numId w:val="7"/>
                           </w:numPr>
+                          <w:rPr>
+                            <w:rFonts w:ascii="Plus Jakarta Sans" w:hAnsi="Plus Jakarta Sans"/>
+                          </w:rPr>
                         </w:pPr>
-                        <w:proofErr w:type="spellStart"/>
                         <w:r>
                           <w:rPr>
                             <w:rFonts w:ascii="Plus Jakarta Sans" w:hAnsi="Plus Jakarta Sans"/>
@@ -3127,7 +3622,6 @@
                           </w:rPr>
                           <w:t>Overige resultaten</w:t>
                         </w:r>
-                        <w:proofErr w:type="spellEnd"/>
                       </w:p>
                       <w:p>
                         <w:pPr>
@@ -3138,10 +3632,10 @@
                             <w:rFonts w:ascii="Plus Jakarta Sans" w:hAnsi="Plus Jakarta Sans"/>
                             <w:b/>
                             <w:bCs/>
+                            <w:noProof/>
                             <w:color w:val="212B46"/>
                             <w:sz w:val="22"/>
                             <w:szCs w:val="22"/>
-                            <w:noProof/>
                           </w:rPr>
                           <w:t>Technologie &amp; tools</w:t>
                         </w:r>
@@ -3150,18 +3644,19 @@
                         <w:pPr>
                           <w:pStyle w:val="BasicParagraph"/>
                           <w:suppressAutoHyphens/>
+                          <w:rPr>
+                            <w:rFonts w:ascii="Plus Jakarta Sans" w:hAnsi="Plus Jakarta Sans"/>
+                          </w:rPr>
                         </w:pPr>
-                        <w:proofErr w:type="spellStart"/>
-                        <w:r>
-                          <w:rPr>
-                            <w:rFonts w:ascii="PlusJakartaSans-Regular" w:hAnsi="PlusJakartaSans-Regular" w:cs="PlusJakartaSans-Regular"/>
+                        <w:r>
+                          <w:rPr>
+                            <w:rFonts w:ascii="Plus Jakarta Sans" w:hAnsi="Plus Jakarta Sans" w:cs="PlusJakartaSans-Regular"/>
                             <w:color w:val="212B46"/>
                             <w:sz w:val="18"/>
                             <w:szCs w:val="18"/>
                           </w:rPr>
                           <w:t>Applicaties, Tools, Methodes, Databases, Programmeertalen</w:t>
                         </w:r>
-                        <w:proofErr w:type="spellEnd"/>
                       </w:p>
                     </wne:txbxContent>
                   </wp:txbx>
@@ -3176,6 +3671,8 @@
             </a:graphic>
           </wp:inline>
         </w:drawing>
+      </w:r>
+      <w:r>
         <w:br/>
       </w:r>
     </w:p>
@@ -3183,10 +3680,13 @@
       <w:pPr>
         <w:pStyle w:val="Titel1"/>
       </w:pPr>
-      <w:keepNext/>
       <w:r>
+        <w:rPr>
+          <w:noProof/>
+        </w:rPr>
+        <w:lastRenderedPageBreak/>
         <w:drawing>
-          <wp:anchor distT="0" distB="0" distL="114300" distR="114300" simplePos="0" relativeHeight="251698176" behindDoc="0" locked="0" layoutInCell="1" allowOverlap="1" wp14:anchorId="7C97E47F" wp14:editId="78F4CE6A">
+          <wp:anchor distT="0" distB="0" distL="114300" distR="114300" simplePos="0" relativeHeight="251666432" behindDoc="0" locked="0" layoutInCell="1" allowOverlap="1" wp14:anchorId="7C97E47F" wp14:editId="78F4CE6A">
             <wp:simplePos x="0" y="0"/>
             <wp:positionH relativeFrom="column">
               <wp:posOffset>-635</wp:posOffset>
@@ -3243,6 +3743,8 @@
       </w:r>
       <w:r>
         <w:t>Overige werkervaring</w:t>
+      </w:r>
+      <w:r>
         <w:br/>
       </w:r>
     </w:p>
@@ -3282,10 +3784,10 @@
           <w:p>
             <w:pPr>
               <w:pStyle w:val="Pa0"/>
+              <w:keepNext/>
               <w:rPr>
                 <w:rStyle w:val="A1"/>
               </w:rPr>
-              <w:keepNext/>
             </w:pPr>
             <w:r>
               <w:rPr>
@@ -3317,10 +3819,10 @@
           <w:p>
             <w:pPr>
               <w:pStyle w:val="Pa0"/>
+              <w:keepNext/>
               <w:rPr>
                 <w:rStyle w:val="A1"/>
               </w:rPr>
-              <w:keepNext/>
             </w:pPr>
             <w:r>
               <w:rPr>
@@ -3337,10 +3839,10 @@
           <w:p>
             <w:pPr>
               <w:pStyle w:val="Pa0"/>
+              <w:keepNext/>
               <w:rPr>
                 <w:rStyle w:val="A1"/>
               </w:rPr>
-              <w:keepNext/>
             </w:pPr>
             <w:r>
               <w:rPr>
@@ -3351,7 +3853,7 @@
           </w:p>
         </w:tc>
       </w:tr>
-      <w:tr xmlns:a="http://purl.oclc.org/ooxml/drawingml/main">
+      <w:tr>
         <w:trPr>
           <w:trHeight w:val="14"/>
         </w:trPr>
@@ -3359,21 +3861,25 @@
           <w:tcPr>
             <w:tcW w:w="67.70pt" w:type="dxa"/>
             <w:tcBorders>
+              <w:bottom w:val="none" w:sz="4" w:space="0" w:color="55DD94"/>
               <w:end w:val="single" w:sz="4" w:space="0" w:color="55DD94"/>
-              <w:bottom w:val="none" w:sz="4" w:space="0" w:color="55DD94"/>
             </w:tcBorders>
             <w:vAlign w:val="center"/>
           </w:tcPr>
           <w:p>
             <w:pPr>
               <w:pStyle w:val="BasicParagraph"/>
+              <w:rPr>
+                <w:color w:val="212B46"/>
+              </w:rPr>
             </w:pPr>
             <w:r>
               <w:rPr>
                 <w:rFonts w:ascii="Plus Jakarta Sans" w:hAnsi="Plus Jakarta Sans"/>
+                <w:noProof/>
+                <w:color w:val="212B46"/>
                 <w:sz w:val="18"/>
                 <w:szCs w:val="16"/>
-                <w:noProof/>
               </w:rPr>
               <w:t>01-2020</w:t>
             </w:r>
@@ -3391,13 +3897,17 @@
           <w:p>
             <w:pPr>
               <w:pStyle w:val="BasicParagraph"/>
+              <w:rPr>
+                <w:color w:val="212B46"/>
+              </w:rPr>
             </w:pPr>
             <w:r>
               <w:rPr>
                 <w:rFonts w:ascii="Plus Jakarta Sans" w:hAnsi="Plus Jakarta Sans"/>
+                <w:noProof/>
+                <w:color w:val="212B46"/>
                 <w:sz w:val="18"/>
                 <w:szCs w:val="16"/>
-                <w:noProof/>
               </w:rPr>
               <w:t>12-2022</w:t>
             </w:r>
@@ -3415,13 +3925,17 @@
             <w:pPr>
               <w:pStyle w:val="BasicParagraph"/>
               <w:keepLines/>
+              <w:rPr>
+                <w:color w:val="212B46"/>
+              </w:rPr>
             </w:pPr>
             <w:r>
               <w:rPr>
                 <w:rFonts w:ascii="Plus Jakarta Sans" w:hAnsi="Plus Jakarta Sans"/>
+                <w:noProof/>
+                <w:color w:val="212B46"/>
                 <w:sz w:val="18"/>
                 <w:szCs w:val="16"/>
-                <w:noProof/>
               </w:rPr>
               <w:t>Opdrachgever</w:t>
             </w:r>
@@ -3439,13 +3953,17 @@
             <w:pPr>
               <w:pStyle w:val="BasicParagraph"/>
               <w:keepLines/>
+              <w:rPr>
+                <w:color w:val="212B46"/>
+              </w:rPr>
             </w:pPr>
             <w:r>
               <w:rPr>
                 <w:rFonts w:ascii="Plus Jakarta Sans" w:hAnsi="Plus Jakarta Sans"/>
+                <w:noProof/>
+                <w:color w:val="212B46"/>
                 <w:sz w:val="18"/>
                 <w:szCs w:val="16"/>
-                <w:noProof/>
               </w:rPr>
               <w:t>Rol</w:t>
             </w:r>
@@ -3464,8 +3982,12 @@
           <w:docGrid w:linePitch="360"/>
         </w:sectPr>
       </w:pPr>
-      <w:br/>
-      <w:br/>
+      <w:r>
+        <w:br/>
+      </w:r>
+      <w:r>
+        <w:br/>
+      </w:r>
     </w:p>
     <w:p>
       <w:pPr>
@@ -3474,9 +3996,7 @@
       <w:r>
         <w:rPr>
           <w:noProof/>
-          <w:u w:val="none"/>
         </w:rPr>
-        <w:keepNext/>
         <w:t>Publicaties</w:t>
       </w:r>
     </w:p>
@@ -3485,8 +4005,11 @@
         <w:pStyle w:val="Titel1"/>
       </w:pPr>
       <w:r>
+        <w:rPr>
+          <w:noProof/>
+        </w:rPr>
         <w:drawing>
-          <wp:anchor distT="0" distB="0" distL="114300" distR="114300" simplePos="0" relativeHeight="251704320" behindDoc="0" locked="0" layoutInCell="1" allowOverlap="1" wp14:anchorId="2352FD51" wp14:editId="2E252DA5">
+          <wp:anchor distT="0" distB="0" distL="114300" distR="114300" simplePos="0" relativeHeight="251669504" behindDoc="0" locked="0" layoutInCell="1" allowOverlap="1" wp14:anchorId="2352FD51" wp14:editId="2E252DA5">
             <wp:simplePos x="0" y="0"/>
             <wp:positionH relativeFrom="column">
               <wp:posOffset>635</wp:posOffset>
@@ -3545,10 +4068,9 @@
         </w:drawing>
       </w:r>
     </w:p>
-    <w:p xmlns:a="http://purl.oclc.org/ooxml/drawingml/main">
+    <w:p>
       <w:pPr>
         <w:spacing w:before="12pt"/>
-        <w:noProof/>
       </w:pPr>
       <w:r>
         <w:rPr>
@@ -3592,29 +4114,28 @@
         <w:t>Titel</w:t>
       </w:r>
     </w:p>
-    <w:p xmlns:a="http://purl.oclc.org/ooxml/drawingml/main">
+    <w:p>
       <w:pPr>
         <w:pStyle w:val="BasicParagraph"/>
+        <w:suppressAutoHyphens/>
         <w:spacing w:after="12pt"/>
         <w:ind w:end="276.65pt"/>
-        <w:suppressAutoHyphens/>
         <w:rPr>
-          <w:rFonts w:ascii="PlusJakartaSans-Regular" w:hAnsi="PlusJakartaSans-Regular" w:cs="PlusJakartaSans-Regular"/>
+          <w:rFonts w:ascii="Plus Jakarta Sans" w:hAnsi="Plus Jakarta Sans" w:cs="PlusJakartaSans-Regular"/>
+          <w:color w:val="212B46"/>
           <w:sz w:val="18"/>
           <w:szCs w:val="18"/>
         </w:rPr>
       </w:pPr>
-      <w:proofErr w:type="spellStart"/>
       <w:r>
         <w:rPr>
-          <w:rFonts w:ascii="PlusJakartaSans-Regular" w:hAnsi="PlusJakartaSans-Regular" w:cs="PlusJakartaSans-Regular"/>
+          <w:rFonts w:ascii="Plus Jakarta Sans" w:hAnsi="Plus Jakarta Sans" w:cs="PlusJakartaSans-Regular"/>
           <w:color w:val="212B46"/>
           <w:sz w:val="18"/>
           <w:szCs w:val="18"/>
         </w:rPr>
         <w:t>Korte omschrijving</w:t>
       </w:r>
-      <w:proofErr w:type="spellEnd"/>
     </w:p>
     <w:p/>
     <w:p>
@@ -3624,9 +4145,7 @@
       <w:r>
         <w:rPr>
           <w:noProof/>
-          <w:u w:val="none"/>
         </w:rPr>
-        <w:keepNext/>
         <w:t>Referenties</w:t>
       </w:r>
     </w:p>
@@ -3635,8 +4154,11 @@
         <w:pStyle w:val="Titel1"/>
       </w:pPr>
       <w:r>
+        <w:rPr>
+          <w:noProof/>
+        </w:rPr>
         <w:drawing>
-          <wp:anchor distT="0" distB="0" distL="114300" distR="114300" simplePos="0" relativeHeight="251704320" behindDoc="0" locked="0" layoutInCell="1" allowOverlap="1" wp14:anchorId="34F09BD8" wp14:editId="2914D6F1">
+          <wp:anchor distT="0" distB="0" distL="114300" distR="114300" simplePos="0" relativeHeight="251668480" behindDoc="0" locked="0" layoutInCell="1" allowOverlap="1" wp14:anchorId="34F09BD8" wp14:editId="2914D6F1">
             <wp:simplePos x="0" y="0"/>
             <wp:positionH relativeFrom="column">
               <wp:posOffset>635</wp:posOffset>
@@ -3695,10 +4217,10 @@
         </w:drawing>
       </w:r>
     </w:p>
-    <w:p xmlns:a="http://purl.oclc.org/ooxml/drawingml/main">
-      <w:pPr>
+    <w:p>
+      <w:pPr>
+        <w:keepNext/>
         <w:spacing w:before="12pt"/>
-        <w:keepNext/>
         <w:rPr>
           <w:rFonts w:ascii="Plus Jakarta Sans" w:hAnsi="Plus Jakarta Sans"/>
           <w:b/>
@@ -3706,25 +4228,24 @@
           <w:sz w:val="22"/>
           <w:szCs w:val="22"/>
         </w:rPr>
-        <w:noProof/>
       </w:pPr>
       <w:r>
         <w:rPr>
           <w:rFonts w:ascii="Plus Jakarta Sans" w:hAnsi="Plus Jakarta Sans"/>
           <w:b/>
           <w:bCs/>
+          <w:color w:val="212B46"/>
           <w:sz w:val="22"/>
           <w:szCs w:val="22"/>
-          <w:color w:val="212B46"/>
         </w:rPr>
         <w:t>2023</w:t>
       </w:r>
       <w:r>
         <w:rPr>
           <w:rFonts w:ascii="Plus Jakarta Sans" w:hAnsi="Plus Jakarta Sans"/>
+          <w:color w:val="55DD94"/>
           <w:sz w:val="22"/>
           <w:szCs w:val="22"/>
-          <w:color w:val="55DD94"/>
         </w:rPr>
         <w:t xml:space="preserve"> | </w:t>
       </w:r>
@@ -3733,18 +4254,18 @@
           <w:rFonts w:ascii="Plus Jakarta Sans" w:hAnsi="Plus Jakarta Sans"/>
           <w:b/>
           <w:bCs/>
+          <w:color w:val="212B46"/>
           <w:sz w:val="22"/>
           <w:szCs w:val="22"/>
-          <w:color w:val="212B46"/>
         </w:rPr>
         <w:t>Naam van referentie</w:t>
       </w:r>
       <w:r>
         <w:rPr>
           <w:rFonts w:ascii="Plus Jakarta Sans" w:hAnsi="Plus Jakarta Sans"/>
+          <w:color w:val="55DD94"/>
           <w:sz w:val="22"/>
           <w:szCs w:val="22"/>
-          <w:color w:val="55DD94"/>
         </w:rPr>
         <w:t xml:space="preserve"> | </w:t>
       </w:r>
@@ -3753,28 +4274,49 @@
           <w:rFonts w:ascii="Plus Jakarta Sans" w:hAnsi="Plus Jakarta Sans"/>
           <w:b/>
           <w:bCs/>
+          <w:color w:val="212B46"/>
           <w:sz w:val="22"/>
           <w:szCs w:val="22"/>
+        </w:rPr>
+        <w:t>Functie van referentie Company name</w:t>
+      </w:r>
+    </w:p>
+    <w:p>
+      <w:pPr>
+        <w:rPr>
+          <w:rFonts w:ascii="Plus Jakarta Sans" w:hAnsi="Plus Jakarta Sans"/>
           <w:color w:val="212B46"/>
         </w:rPr>
-        <w:t>Functie van referentie</w:t>
-        <w:t xml:space="preserve"> </w:t>
-        <w:t>Company name</w:t>
-      </w:r>
-    </w:p>
-    <w:p xmlns:a="http://purl.oclc.org/ooxml/drawingml/main">
-      <w:proofErr w:type="spellStart"/>
+      </w:pPr>
       <w:r>
         <w:rPr>
-          <w:rFonts w:ascii="PlusJakartaSans-Regular" w:hAnsi="PlusJakartaSans-Regular" w:cs="PlusJakartaSans-Regular"/>
+          <w:rFonts w:ascii="Plus Jakarta Sans" w:hAnsi="Plus Jakarta Sans" w:cs="PlusJakartaSans-Regular"/>
           <w:color w:val="212B46"/>
           <w:sz w:val="18"/>
           <w:szCs w:val="18"/>
-          <w:keepLines/>
         </w:rPr>
-        <w:t>Korte omschrijving / aanbeveling.</w:t>
+        <w:t xml:space="preserve">Korte </w:t>
       </w:r>
-      <w:proofErr w:type="spellEnd"/>
+      <w:proofErr w:type="gramStart"/>
+      <w:r>
+        <w:rPr>
+          <w:rFonts w:ascii="Plus Jakarta Sans" w:hAnsi="Plus Jakarta Sans" w:cs="PlusJakartaSans-Regular"/>
+          <w:color w:val="212B46"/>
+          <w:sz w:val="18"/>
+          <w:szCs w:val="18"/>
+        </w:rPr>
+        <w:t>omschrijving /</w:t>
+      </w:r>
+      <w:proofErr w:type="gramEnd"/>
+      <w:r>
+        <w:rPr>
+          <w:rFonts w:ascii="Plus Jakarta Sans" w:hAnsi="Plus Jakarta Sans" w:cs="PlusJakartaSans-Regular"/>
+          <w:color w:val="212B46"/>
+          <w:sz w:val="18"/>
+          <w:szCs w:val="18"/>
+        </w:rPr>
+        <w:t xml:space="preserve"> aanbeveling.</w:t>
+      </w:r>
     </w:p>
     <w:sectPr>
       <w:type w:val="continuous"/>
@@ -3788,7 +4330,7 @@
 </file>
 
 <file path=word/endnotes.xml><?xml version="1.0" encoding="utf-8"?>
-<w:endnotes xmlns:cx="http://schemas.microsoft.com/office/drawing/2014/chartex" xmlns:cx1="http://schemas.microsoft.com/office/drawing/2015/9/8/chartex" xmlns:cx2="http://schemas.microsoft.com/office/drawing/2015/10/21/chartex" xmlns:cx3="http://schemas.microsoft.com/office/drawing/2016/5/9/chartex" xmlns:cx4="http://schemas.microsoft.com/office/drawing/2016/5/10/chartex" xmlns:cx5="http://schemas.microsoft.com/office/drawing/2016/5/11/chartex" xmlns:cx6="http://schemas.microsoft.com/office/drawing/2016/5/12/chartex" xmlns:cx7="http://schemas.microsoft.com/office/drawing/2016/5/13/chartex" xmlns:cx8="http://schemas.microsoft.com/office/drawing/2016/5/14/chartex" xmlns:mc="http://schemas.openxmlformats.org/markup-compatibility/2006" xmlns:aink="http://schemas.microsoft.com/office/drawing/2016/ink" xmlns:am3d="http://schemas.microsoft.com/office/drawing/2017/model3d" xmlns:o="urn:schemas-microsoft-com:office:office" xmlns:oel="http://schemas.microsoft.com/office/2019/extlst" xmlns:r="http://purl.oclc.org/ooxml/officeDocument/relationships" xmlns:m="http://purl.oclc.org/ooxml/officeDocument/math" xmlns:v="urn:schemas-microsoft-com:vml" xmlns:wp14="http://schemas.microsoft.com/office/word/2010/wordprocessingDrawing" xmlns:wp="http://purl.oclc.org/ooxml/drawingml/wordprocessingDrawing" xmlns:w10="urn:schemas-microsoft-com:office:word" xmlns:w="http://purl.oclc.org/ooxml/wordprocessingml/main" xmlns:w14="http://schemas.microsoft.com/office/word/2010/wordml" xmlns:w15="http://schemas.microsoft.com/office/word/2012/wordml" xmlns:w16cex="http://schemas.microsoft.com/office/word/2018/wordml/cex" xmlns:w16cid="http://schemas.microsoft.com/office/word/2016/wordml/cid" xmlns:w16="http://schemas.microsoft.com/office/word/2018/wordml" xmlns:w16du="http://schemas.microsoft.com/office/word/2023/wordml/word16du" xmlns:w16sdtdh="http://schemas.microsoft.com/office/word/2020/wordml/sdtdatahash" xmlns:w16sdtfl="http://schemas.microsoft.com/office/word/2024/wordml/sdtformatlock" xmlns:w16se="http://schemas.microsoft.com/office/word/2015/wordml/symex" xmlns:wpi="http://schemas.microsoft.com/office/word/2010/wordprocessingInk" xmlns:wne="http://schemas.microsoft.com/office/word/2006/wordml" mc:Ignorable="w14 w15 w16se w16cid w16 w16cex w16sdtdh w16sdtfl w16du wne wp14">
+<w:endnotes xmlns:cx="http://schemas.microsoft.com/office/drawing/2014/chartex" xmlns:cx1="http://schemas.microsoft.com/office/drawing/2015/9/8/chartex" xmlns:cx2="http://schemas.microsoft.com/office/drawing/2015/10/21/chartex" xmlns:cx3="http://schemas.microsoft.com/office/drawing/2016/5/9/chartex" xmlns:cx4="http://schemas.microsoft.com/office/drawing/2016/5/10/chartex" xmlns:cx5="http://schemas.microsoft.com/office/drawing/2016/5/11/chartex" xmlns:cx6="http://schemas.microsoft.com/office/drawing/2016/5/12/chartex" xmlns:cx7="http://schemas.microsoft.com/office/drawing/2016/5/13/chartex" xmlns:cx8="http://schemas.microsoft.com/office/drawing/2016/5/14/chartex" xmlns:mc="http://schemas.openxmlformats.org/markup-compatibility/2006" xmlns:aink="http://schemas.microsoft.com/office/drawing/2016/ink" xmlns:am3d="http://schemas.microsoft.com/office/drawing/2017/model3d" xmlns:o="urn:schemas-microsoft-com:office:office" xmlns:oel="http://schemas.microsoft.com/office/2019/extlst" xmlns:r="http://purl.oclc.org/ooxml/officeDocument/relationships" xmlns:m="http://purl.oclc.org/ooxml/officeDocument/math" xmlns:v="urn:schemas-microsoft-com:vml" xmlns:wp14="http://schemas.microsoft.com/office/word/2010/wordprocessingDrawing" xmlns:wp="http://purl.oclc.org/ooxml/drawingml/wordprocessingDrawing" xmlns:w10="urn:schemas-microsoft-com:office:word" xmlns:w="http://purl.oclc.org/ooxml/wordprocessingml/main" xmlns:w14="http://schemas.microsoft.com/office/word/2010/wordml" xmlns:w15="http://schemas.microsoft.com/office/word/2012/wordml" xmlns:w16cei="http://schemas.microsoft.com/office/word/2026/wordml/cei" xmlns:w16cex="http://schemas.microsoft.com/office/word/2018/wordml/cex" xmlns:w16cid="http://schemas.microsoft.com/office/word/2016/wordml/cid" xmlns:w16="http://schemas.microsoft.com/office/word/2018/wordml" xmlns:w16du="http://schemas.microsoft.com/office/word/2023/wordml/word16du" xmlns:w16sdtdh="http://schemas.microsoft.com/office/word/2020/wordml/sdtdatahash" xmlns:w16sdtfl="http://schemas.microsoft.com/office/word/2024/wordml/sdtformatlock" xmlns:w16se="http://schemas.microsoft.com/office/word/2015/wordml/symex" xmlns:wpi="http://schemas.microsoft.com/office/word/2010/wordprocessingInk" xmlns:wne="http://schemas.microsoft.com/office/word/2006/wordml" mc:Ignorable="w14 w15 w16se w16cid w16 w16cex w16sdtdh w16sdtfl w16du wne wp14">
   <w:endnote w:type="separator" w:id="-1">
     <w:p>
       <w:pPr>
@@ -3813,19 +4355,19 @@
 </file>
 
 <file path=word/footer1.xml><?xml version="1.0" encoding="utf-8"?>
-<w:ftr xmlns:w="http://purl.oclc.org/ooxml/wordprocessingml/main" xmlns:wp="http://purl.oclc.org/ooxml/drawingml/wordprocessingDrawing" xmlns:r="http://purl.oclc.org/ooxml/officeDocument/relationships" xmlns:mc="http://schemas.openxmlformats.org/markup-compatibility/2006" xmlns:w14="http://schemas.microsoft.com/office/word/2010/wordml" xmlns:wp14="http://schemas.microsoft.com/office/word/2010/wordprocessingDrawing" mc:Ignorable="w14 wp14">
+<w:ftr xmlns:cx="http://schemas.microsoft.com/office/drawing/2014/chartex" xmlns:cx1="http://schemas.microsoft.com/office/drawing/2015/9/8/chartex" xmlns:cx2="http://schemas.microsoft.com/office/drawing/2015/10/21/chartex" xmlns:cx3="http://schemas.microsoft.com/office/drawing/2016/5/9/chartex" xmlns:cx4="http://schemas.microsoft.com/office/drawing/2016/5/10/chartex" xmlns:cx5="http://schemas.microsoft.com/office/drawing/2016/5/11/chartex" xmlns:cx6="http://schemas.microsoft.com/office/drawing/2016/5/12/chartex" xmlns:cx7="http://schemas.microsoft.com/office/drawing/2016/5/13/chartex" xmlns:cx8="http://schemas.microsoft.com/office/drawing/2016/5/14/chartex" xmlns:mc="http://schemas.openxmlformats.org/markup-compatibility/2006" xmlns:aink="http://schemas.microsoft.com/office/drawing/2016/ink" xmlns:am3d="http://schemas.microsoft.com/office/drawing/2017/model3d" xmlns:o="urn:schemas-microsoft-com:office:office" xmlns:oel="http://schemas.microsoft.com/office/2019/extlst" xmlns:r="http://purl.oclc.org/ooxml/officeDocument/relationships" xmlns:m="http://purl.oclc.org/ooxml/officeDocument/math" xmlns:v="urn:schemas-microsoft-com:vml" xmlns:wp14="http://schemas.microsoft.com/office/word/2010/wordprocessingDrawing" xmlns:wp="http://purl.oclc.org/ooxml/drawingml/wordprocessingDrawing" xmlns:w10="urn:schemas-microsoft-com:office:word" xmlns:w="http://purl.oclc.org/ooxml/wordprocessingml/main" xmlns:w14="http://schemas.microsoft.com/office/word/2010/wordml" xmlns:w15="http://schemas.microsoft.com/office/word/2012/wordml" xmlns:w16cei="http://schemas.microsoft.com/office/word/2026/wordml/cei" xmlns:w16cex="http://schemas.microsoft.com/office/word/2018/wordml/cex" xmlns:w16cid="http://schemas.microsoft.com/office/word/2016/wordml/cid" xmlns:w16="http://schemas.microsoft.com/office/word/2018/wordml" xmlns:w16du="http://schemas.microsoft.com/office/word/2023/wordml/word16du" xmlns:w16sdtdh="http://schemas.microsoft.com/office/word/2020/wordml/sdtdatahash" xmlns:w16sdtfl="http://schemas.microsoft.com/office/word/2024/wordml/sdtformatlock" xmlns:w16se="http://schemas.microsoft.com/office/word/2015/wordml/symex" xmlns:wpi="http://schemas.microsoft.com/office/word/2010/wordprocessingInk" xmlns:wne="http://schemas.microsoft.com/office/word/2006/wordml" mc:Ignorable="w14 w15 w16se w16cid w16 w16cex w16sdtdh w16sdtfl w16du wne wp14">
   <w:p>
     <w:pPr>
       <w:pStyle w:val="Voettekst"/>
       <w:tabs>
-        <w:tab w:val="clear" w:pos="4513"/>
-        <w:tab w:val="clear" w:pos="9026"/>
-        <w:tab w:val="left" w:pos="0"/>
-        <w:tab w:val="left" w:pos="2410"/>
-        <w:tab w:val="left" w:pos="6804"/>
-        <w:tab w:val="left" w:pos="8364"/>
+        <w:tab w:val="clear" w:pos="225.65pt"/>
+        <w:tab w:val="clear" w:pos="451.30pt"/>
+        <w:tab w:val="start" w:pos="0pt"/>
+        <w:tab w:val="start" w:pos="120.50pt"/>
+        <w:tab w:val="start" w:pos="340.20pt"/>
+        <w:tab w:val="start" w:pos="418.20pt"/>
       </w:tabs>
-      <w:ind w:right="-142"/>
+      <w:ind w:end="-7.10pt"/>
       <w:jc w:val="center"/>
       <w:rPr>
         <w:color w:val="FFFFFF" w:themeColor="background1"/>
@@ -3835,6 +4377,7 @@
     </w:pPr>
     <w:r>
       <w:rPr>
+        <w:noProof/>
         <w:color w:val="FFFFFF" w:themeColor="background1"/>
         <w:sz w:val="18"/>
         <w:szCs w:val="18"/>
@@ -3900,30 +4443,41 @@
     </w:r>
     <w:r>
       <w:rPr>
+        <w:noProof/>
         <w:color w:val="FFFFFF" w:themeColor="background1"/>
         <w:sz w:val="18"/>
         <w:szCs w:val="18"/>
+      </w:rPr>
+      <w:t>CONTACTPERSOON</w:t>
+    </w:r>
+    <w:r>
+      <w:rPr>
         <w:noProof/>
-      </w:rPr>
-      <w:t>CONTACTPERSOON</w:t>
-      <w:tab/>
-      <w:t/>
-      <w:tab/>
-      <w:t/>
+        <w:color w:val="FFFFFF" w:themeColor="background1"/>
+        <w:sz w:val="18"/>
+        <w:szCs w:val="18"/>
+      </w:rPr>
       <w:tab/>
     </w:r>
-    <w:hyperlink r:id="rId2" w:history="1">
-      <w:r>
-        <w:rPr>
-          <w:rStyle w:val="Hyperlink"/>
-          <w:color w:val="FFFFFF" w:themeColor="background1"/>
-          <w:sz w:val="18"/>
-          <w:szCs w:val="18"/>
-          <w:noProof/>
-        </w:rPr>
-        <w:t/>
-      </w:r>
-    </w:hyperlink>
+    <w:r>
+      <w:rPr>
+        <w:noProof/>
+        <w:color w:val="FFFFFF" w:themeColor="background1"/>
+        <w:sz w:val="18"/>
+        <w:szCs w:val="18"/>
+      </w:rPr>
+      <w:tab/>
+    </w:r>
+    <w:r>
+      <w:rPr>
+        <w:noProof/>
+        <w:color w:val="FFFFFF" w:themeColor="background1"/>
+        <w:sz w:val="18"/>
+        <w:szCs w:val="18"/>
+      </w:rPr>
+      <w:tab/>
+    </w:r>
+    <w:hyperlink r:id="rId2" w:history="1"/>
   </w:p>
   <w:p>
     <w:pPr>
@@ -3937,55 +4491,69 @@
 </file>
 
 <file path=word/footer2.xml><?xml version="1.0" encoding="utf-8"?>
-<w:ftr xmlns:w="http://purl.oclc.org/ooxml/wordprocessingml/main" xmlns:r="http://purl.oclc.org/ooxml/officeDocument/relationships" xmlns:mc="http://schemas.openxmlformats.org/markup-compatibility/2006" xmlns:w14="http://schemas.microsoft.com/office/word/2010/wordml" mc:Ignorable="w14">
+<w:ftr xmlns:cx="http://schemas.microsoft.com/office/drawing/2014/chartex" xmlns:cx1="http://schemas.microsoft.com/office/drawing/2015/9/8/chartex" xmlns:cx2="http://schemas.microsoft.com/office/drawing/2015/10/21/chartex" xmlns:cx3="http://schemas.microsoft.com/office/drawing/2016/5/9/chartex" xmlns:cx4="http://schemas.microsoft.com/office/drawing/2016/5/10/chartex" xmlns:cx5="http://schemas.microsoft.com/office/drawing/2016/5/11/chartex" xmlns:cx6="http://schemas.microsoft.com/office/drawing/2016/5/12/chartex" xmlns:cx7="http://schemas.microsoft.com/office/drawing/2016/5/13/chartex" xmlns:cx8="http://schemas.microsoft.com/office/drawing/2016/5/14/chartex" xmlns:mc="http://schemas.openxmlformats.org/markup-compatibility/2006" xmlns:aink="http://schemas.microsoft.com/office/drawing/2016/ink" xmlns:am3d="http://schemas.microsoft.com/office/drawing/2017/model3d" xmlns:o="urn:schemas-microsoft-com:office:office" xmlns:oel="http://schemas.microsoft.com/office/2019/extlst" xmlns:r="http://purl.oclc.org/ooxml/officeDocument/relationships" xmlns:m="http://purl.oclc.org/ooxml/officeDocument/math" xmlns:v="urn:schemas-microsoft-com:vml" xmlns:wp14="http://schemas.microsoft.com/office/word/2010/wordprocessingDrawing" xmlns:wp="http://purl.oclc.org/ooxml/drawingml/wordprocessingDrawing" xmlns:w10="urn:schemas-microsoft-com:office:word" xmlns:w="http://purl.oclc.org/ooxml/wordprocessingml/main" xmlns:w14="http://schemas.microsoft.com/office/word/2010/wordml" xmlns:w15="http://schemas.microsoft.com/office/word/2012/wordml" xmlns:w16cei="http://schemas.microsoft.com/office/word/2026/wordml/cei" xmlns:w16cex="http://schemas.microsoft.com/office/word/2018/wordml/cex" xmlns:w16cid="http://schemas.microsoft.com/office/word/2016/wordml/cid" xmlns:w16="http://schemas.microsoft.com/office/word/2018/wordml" xmlns:w16du="http://schemas.microsoft.com/office/word/2023/wordml/word16du" xmlns:w16sdtdh="http://schemas.microsoft.com/office/word/2020/wordml/sdtdatahash" xmlns:w16sdtfl="http://schemas.microsoft.com/office/word/2024/wordml/sdtformatlock" xmlns:w16se="http://schemas.microsoft.com/office/word/2015/wordml/symex" xmlns:wpi="http://schemas.microsoft.com/office/word/2010/wordprocessingInk" xmlns:wne="http://schemas.microsoft.com/office/word/2006/wordml" mc:Ignorable="w14 w15 w16se w16cid w16 w16cex w16sdtdh w16sdtfl w16du wne wp14">
   <w:p>
     <w:pPr>
       <w:pStyle w:val="Voettekst"/>
       <w:tabs>
-        <w:tab w:val="clear" w:pos="4513"/>
-        <w:tab w:val="clear" w:pos="9026"/>
-        <w:tab w:val="left" w:pos="0"/>
-        <w:tab w:val="left" w:pos="2410"/>
-        <w:tab w:val="left" w:pos="6804"/>
-        <w:tab w:val="left" w:pos="8364"/>
+        <w:tab w:val="clear" w:pos="225.65pt"/>
+        <w:tab w:val="clear" w:pos="451.30pt"/>
+        <w:tab w:val="start" w:pos="0pt"/>
+        <w:tab w:val="start" w:pos="120.50pt"/>
+        <w:tab w:val="start" w:pos="340.20pt"/>
+        <w:tab w:val="start" w:pos="418.20pt"/>
       </w:tabs>
-      <w:ind w:right="-142"/>
+      <w:ind w:end="-7.10pt"/>
       <w:jc w:val="center"/>
       <w:rPr>
+        <w:color w:val="212B46"/>
         <w:sz w:val="18"/>
         <w:szCs w:val="18"/>
       </w:rPr>
     </w:pPr>
     <w:r>
       <w:rPr>
+        <w:noProof/>
+        <w:color w:val="212B46"/>
         <w:sz w:val="18"/>
         <w:szCs w:val="18"/>
+      </w:rPr>
+      <w:t>CONTACTPERSOON</w:t>
+    </w:r>
+    <w:r>
+      <w:rPr>
         <w:noProof/>
-      </w:rPr>
-      <w:t>CONTACTPERSOON</w:t>
-      <w:tab/>
-      <w:t/>
-      <w:tab/>
-      <w:t/>
+        <w:color w:val="212B46"/>
+        <w:sz w:val="18"/>
+        <w:szCs w:val="18"/>
+      </w:rPr>
       <w:tab/>
     </w:r>
-    <w:hyperlink r:id="rId1" w:history="1">
-      <w:r>
-        <w:rPr>
-          <w:rStyle w:val="Hyperlink"/>
-          <w:sz w:val="18"/>
-          <w:szCs w:val="18"/>
-          <w:noProof/>
-        </w:rPr>
-        <w:t/>
-      </w:r>
-    </w:hyperlink>
+    <w:r>
+      <w:rPr>
+        <w:noProof/>
+        <w:color w:val="212B46"/>
+        <w:sz w:val="18"/>
+        <w:szCs w:val="18"/>
+      </w:rPr>
+      <w:tab/>
+    </w:r>
+    <w:r>
+      <w:rPr>
+        <w:noProof/>
+        <w:color w:val="212B46"/>
+        <w:sz w:val="18"/>
+        <w:szCs w:val="18"/>
+      </w:rPr>
+      <w:tab/>
+    </w:r>
+    <w:hyperlink r:id="rId1" w:history="1"/>
   </w:p>
 </w:ftr>
 </file>
 
 <file path=word/footnotes.xml><?xml version="1.0" encoding="utf-8"?>
-<w:footnotes xmlns:cx="http://schemas.microsoft.com/office/drawing/2014/chartex" xmlns:cx1="http://schemas.microsoft.com/office/drawing/2015/9/8/chartex" xmlns:cx2="http://schemas.microsoft.com/office/drawing/2015/10/21/chartex" xmlns:cx3="http://schemas.microsoft.com/office/drawing/2016/5/9/chartex" xmlns:cx4="http://schemas.microsoft.com/office/drawing/2016/5/10/chartex" xmlns:cx5="http://schemas.microsoft.com/office/drawing/2016/5/11/chartex" xmlns:cx6="http://schemas.microsoft.com/office/drawing/2016/5/12/chartex" xmlns:cx7="http://schemas.microsoft.com/office/drawing/2016/5/13/chartex" xmlns:cx8="http://schemas.microsoft.com/office/drawing/2016/5/14/chartex" xmlns:mc="http://schemas.openxmlformats.org/markup-compatibility/2006" xmlns:aink="http://schemas.microsoft.com/office/drawing/2016/ink" xmlns:am3d="http://schemas.microsoft.com/office/drawing/2017/model3d" xmlns:o="urn:schemas-microsoft-com:office:office" xmlns:oel="http://schemas.microsoft.com/office/2019/extlst" xmlns:r="http://purl.oclc.org/ooxml/officeDocument/relationships" xmlns:m="http://purl.oclc.org/ooxml/officeDocument/math" xmlns:v="urn:schemas-microsoft-com:vml" xmlns:wp14="http://schemas.microsoft.com/office/word/2010/wordprocessingDrawing" xmlns:wp="http://purl.oclc.org/ooxml/drawingml/wordprocessingDrawing" xmlns:w10="urn:schemas-microsoft-com:office:word" xmlns:w="http://purl.oclc.org/ooxml/wordprocessingml/main" xmlns:w14="http://schemas.microsoft.com/office/word/2010/wordml" xmlns:w15="http://schemas.microsoft.com/office/word/2012/wordml" xmlns:w16cex="http://schemas.microsoft.com/office/word/2018/wordml/cex" xmlns:w16cid="http://schemas.microsoft.com/office/word/2016/wordml/cid" xmlns:w16="http://schemas.microsoft.com/office/word/2018/wordml" xmlns:w16du="http://schemas.microsoft.com/office/word/2023/wordml/word16du" xmlns:w16sdtdh="http://schemas.microsoft.com/office/word/2020/wordml/sdtdatahash" xmlns:w16sdtfl="http://schemas.microsoft.com/office/word/2024/wordml/sdtformatlock" xmlns:w16se="http://schemas.microsoft.com/office/word/2015/wordml/symex" xmlns:wpi="http://schemas.microsoft.com/office/word/2010/wordprocessingInk" xmlns:wne="http://schemas.microsoft.com/office/word/2006/wordml" mc:Ignorable="w14 w15 w16se w16cid w16 w16cex w16sdtdh w16sdtfl w16du wne wp14">
+<w:footnotes xmlns:cx="http://schemas.microsoft.com/office/drawing/2014/chartex" xmlns:cx1="http://schemas.microsoft.com/office/drawing/2015/9/8/chartex" xmlns:cx2="http://schemas.microsoft.com/office/drawing/2015/10/21/chartex" xmlns:cx3="http://schemas.microsoft.com/office/drawing/2016/5/9/chartex" xmlns:cx4="http://schemas.microsoft.com/office/drawing/2016/5/10/chartex" xmlns:cx5="http://schemas.microsoft.com/office/drawing/2016/5/11/chartex" xmlns:cx6="http://schemas.microsoft.com/office/drawing/2016/5/12/chartex" xmlns:cx7="http://schemas.microsoft.com/office/drawing/2016/5/13/chartex" xmlns:cx8="http://schemas.microsoft.com/office/drawing/2016/5/14/chartex" xmlns:mc="http://schemas.openxmlformats.org/markup-compatibility/2006" xmlns:aink="http://schemas.microsoft.com/office/drawing/2016/ink" xmlns:am3d="http://schemas.microsoft.com/office/drawing/2017/model3d" xmlns:o="urn:schemas-microsoft-com:office:office" xmlns:oel="http://schemas.microsoft.com/office/2019/extlst" xmlns:r="http://purl.oclc.org/ooxml/officeDocument/relationships" xmlns:m="http://purl.oclc.org/ooxml/officeDocument/math" xmlns:v="urn:schemas-microsoft-com:vml" xmlns:wp14="http://schemas.microsoft.com/office/word/2010/wordprocessingDrawing" xmlns:wp="http://purl.oclc.org/ooxml/drawingml/wordprocessingDrawing" xmlns:w10="urn:schemas-microsoft-com:office:word" xmlns:w="http://purl.oclc.org/ooxml/wordprocessingml/main" xmlns:w14="http://schemas.microsoft.com/office/word/2010/wordml" xmlns:w15="http://schemas.microsoft.com/office/word/2012/wordml" xmlns:w16cei="http://schemas.microsoft.com/office/word/2026/wordml/cei" xmlns:w16cex="http://schemas.microsoft.com/office/word/2018/wordml/cex" xmlns:w16cid="http://schemas.microsoft.com/office/word/2016/wordml/cid" xmlns:w16="http://schemas.microsoft.com/office/word/2018/wordml" xmlns:w16du="http://schemas.microsoft.com/office/word/2023/wordml/word16du" xmlns:w16sdtdh="http://schemas.microsoft.com/office/word/2020/wordml/sdtdatahash" xmlns:w16sdtfl="http://schemas.microsoft.com/office/word/2024/wordml/sdtformatlock" xmlns:w16se="http://schemas.microsoft.com/office/word/2015/wordml/symex" xmlns:wpi="http://schemas.microsoft.com/office/word/2010/wordprocessingInk" xmlns:wne="http://schemas.microsoft.com/office/word/2006/wordml" mc:Ignorable="w14 w15 w16se w16cid w16 w16cex w16sdtdh w16sdtfl w16du wne wp14">
   <w:footnote w:type="separator" w:id="-1">
     <w:p>
       <w:pPr>
@@ -4010,7 +4578,7 @@
 </file>
 
 <file path=word/header1.xml><?xml version="1.0" encoding="utf-8"?>
-<w:hdr xmlns:cx="http://schemas.microsoft.com/office/drawing/2014/chartex" xmlns:cx1="http://schemas.microsoft.com/office/drawing/2015/9/8/chartex" xmlns:cx2="http://schemas.microsoft.com/office/drawing/2015/10/21/chartex" xmlns:cx3="http://schemas.microsoft.com/office/drawing/2016/5/9/chartex" xmlns:cx4="http://schemas.microsoft.com/office/drawing/2016/5/10/chartex" xmlns:cx5="http://schemas.microsoft.com/office/drawing/2016/5/11/chartex" xmlns:cx6="http://schemas.microsoft.com/office/drawing/2016/5/12/chartex" xmlns:cx7="http://schemas.microsoft.com/office/drawing/2016/5/13/chartex" xmlns:cx8="http://schemas.microsoft.com/office/drawing/2016/5/14/chartex" xmlns:mc="http://schemas.openxmlformats.org/markup-compatibility/2006" xmlns:aink="http://schemas.microsoft.com/office/drawing/2016/ink" xmlns:am3d="http://schemas.microsoft.com/office/drawing/2017/model3d" xmlns:o="urn:schemas-microsoft-com:office:office" xmlns:oel="http://schemas.microsoft.com/office/2019/extlst" xmlns:r="http://purl.oclc.org/ooxml/officeDocument/relationships" xmlns:m="http://purl.oclc.org/ooxml/officeDocument/math" xmlns:v="urn:schemas-microsoft-com:vml" xmlns:wp14="http://schemas.microsoft.com/office/word/2010/wordprocessingDrawing" xmlns:wp="http://purl.oclc.org/ooxml/drawingml/wordprocessingDrawing" xmlns:w10="urn:schemas-microsoft-com:office:word" xmlns:w="http://purl.oclc.org/ooxml/wordprocessingml/main" xmlns:w14="http://schemas.microsoft.com/office/word/2010/wordml" xmlns:w15="http://schemas.microsoft.com/office/word/2012/wordml" xmlns:w16cex="http://schemas.microsoft.com/office/word/2018/wordml/cex" xmlns:w16cid="http://schemas.microsoft.com/office/word/2016/wordml/cid" xmlns:w16="http://schemas.microsoft.com/office/word/2018/wordml" xmlns:w16du="http://schemas.microsoft.com/office/word/2023/wordml/word16du" xmlns:w16sdtdh="http://schemas.microsoft.com/office/word/2020/wordml/sdtdatahash" xmlns:w16sdtfl="http://schemas.microsoft.com/office/word/2024/wordml/sdtformatlock" xmlns:w16se="http://schemas.microsoft.com/office/word/2015/wordml/symex" xmlns:wpi="http://schemas.microsoft.com/office/word/2010/wordprocessingInk" xmlns:wne="http://schemas.microsoft.com/office/word/2006/wordml" mc:Ignorable="w14 w15 w16se w16cid w16 w16cex w16sdtdh w16sdtfl w16du wne wp14">
+<w:hdr xmlns:cx="http://schemas.microsoft.com/office/drawing/2014/chartex" xmlns:cx1="http://schemas.microsoft.com/office/drawing/2015/9/8/chartex" xmlns:cx2="http://schemas.microsoft.com/office/drawing/2015/10/21/chartex" xmlns:cx3="http://schemas.microsoft.com/office/drawing/2016/5/9/chartex" xmlns:cx4="http://schemas.microsoft.com/office/drawing/2016/5/10/chartex" xmlns:cx5="http://schemas.microsoft.com/office/drawing/2016/5/11/chartex" xmlns:cx6="http://schemas.microsoft.com/office/drawing/2016/5/12/chartex" xmlns:cx7="http://schemas.microsoft.com/office/drawing/2016/5/13/chartex" xmlns:cx8="http://schemas.microsoft.com/office/drawing/2016/5/14/chartex" xmlns:mc="http://schemas.openxmlformats.org/markup-compatibility/2006" xmlns:aink="http://schemas.microsoft.com/office/drawing/2016/ink" xmlns:am3d="http://schemas.microsoft.com/office/drawing/2017/model3d" xmlns:o="urn:schemas-microsoft-com:office:office" xmlns:oel="http://schemas.microsoft.com/office/2019/extlst" xmlns:r="http://purl.oclc.org/ooxml/officeDocument/relationships" xmlns:m="http://purl.oclc.org/ooxml/officeDocument/math" xmlns:v="urn:schemas-microsoft-com:vml" xmlns:wp14="http://schemas.microsoft.com/office/word/2010/wordprocessingDrawing" xmlns:wp="http://purl.oclc.org/ooxml/drawingml/wordprocessingDrawing" xmlns:w10="urn:schemas-microsoft-com:office:word" xmlns:w="http://purl.oclc.org/ooxml/wordprocessingml/main" xmlns:w14="http://schemas.microsoft.com/office/word/2010/wordml" xmlns:w15="http://schemas.microsoft.com/office/word/2012/wordml" xmlns:w16cei="http://schemas.microsoft.com/office/word/2026/wordml/cei" xmlns:w16cex="http://schemas.microsoft.com/office/word/2018/wordml/cex" xmlns:w16cid="http://schemas.microsoft.com/office/word/2016/wordml/cid" xmlns:w16="http://schemas.microsoft.com/office/word/2018/wordml" xmlns:w16du="http://schemas.microsoft.com/office/word/2023/wordml/word16du" xmlns:w16sdtdh="http://schemas.microsoft.com/office/word/2020/wordml/sdtdatahash" xmlns:w16sdtfl="http://schemas.microsoft.com/office/word/2024/wordml/sdtformatlock" xmlns:w16se="http://schemas.microsoft.com/office/word/2015/wordml/symex" xmlns:wpi="http://schemas.microsoft.com/office/word/2010/wordprocessingInk" xmlns:wne="http://schemas.microsoft.com/office/word/2006/wordml" mc:Ignorable="w14 w15 w16se w16cid w16 w16cex w16sdtdh w16sdtfl w16du wne wp14">
   <w:p>
     <w:pPr>
       <w:pStyle w:val="Koptekst"/>
@@ -4067,7 +4635,7 @@
 </file>
 
 <file path=word/numbering.xml><?xml version="1.0" encoding="utf-8"?>
-<w:numbering xmlns:cx="http://schemas.microsoft.com/office/drawing/2014/chartex" xmlns:cx1="http://schemas.microsoft.com/office/drawing/2015/9/8/chartex" xmlns:cx2="http://schemas.microsoft.com/office/drawing/2015/10/21/chartex" xmlns:cx3="http://schemas.microsoft.com/office/drawing/2016/5/9/chartex" xmlns:cx4="http://schemas.microsoft.com/office/drawing/2016/5/10/chartex" xmlns:cx5="http://schemas.microsoft.com/office/drawing/2016/5/11/chartex" xmlns:cx6="http://schemas.microsoft.com/office/drawing/2016/5/12/chartex" xmlns:cx7="http://schemas.microsoft.com/office/drawing/2016/5/13/chartex" xmlns:cx8="http://schemas.microsoft.com/office/drawing/2016/5/14/chartex" xmlns:mc="http://schemas.openxmlformats.org/markup-compatibility/2006" xmlns:aink="http://schemas.microsoft.com/office/drawing/2016/ink" xmlns:am3d="http://schemas.microsoft.com/office/drawing/2017/model3d" xmlns:o="urn:schemas-microsoft-com:office:office" xmlns:oel="http://schemas.microsoft.com/office/2019/extlst" xmlns:r="http://purl.oclc.org/ooxml/officeDocument/relationships" xmlns:m="http://purl.oclc.org/ooxml/officeDocument/math" xmlns:v="urn:schemas-microsoft-com:vml" xmlns:wp14="http://schemas.microsoft.com/office/word/2010/wordprocessingDrawing" xmlns:wp="http://purl.oclc.org/ooxml/drawingml/wordprocessingDrawing" xmlns:w10="urn:schemas-microsoft-com:office:word" xmlns:w="http://purl.oclc.org/ooxml/wordprocessingml/main" xmlns:w14="http://schemas.microsoft.com/office/word/2010/wordml" xmlns:w15="http://schemas.microsoft.com/office/word/2012/wordml" xmlns:w16cex="http://schemas.microsoft.com/office/word/2018/wordml/cex" xmlns:w16cid="http://schemas.microsoft.com/office/word/2016/wordml/cid" xmlns:w16="http://schemas.microsoft.com/office/word/2018/wordml" xmlns:w16du="http://schemas.microsoft.com/office/word/2023/wordml/word16du" xmlns:w16sdtdh="http://schemas.microsoft.com/office/word/2020/wordml/sdtdatahash" xmlns:w16sdtfl="http://schemas.microsoft.com/office/word/2024/wordml/sdtformatlock" xmlns:w16se="http://schemas.microsoft.com/office/word/2015/wordml/symex" xmlns:wpi="http://schemas.microsoft.com/office/word/2010/wordprocessingInk" xmlns:wne="http://schemas.microsoft.com/office/word/2006/wordml" mc:Ignorable="w14 w15 w16se w16cid w16 w16cex w16sdtdh w16sdtfl w16du wne wp14">
+<w:numbering xmlns:cx="http://schemas.microsoft.com/office/drawing/2014/chartex" xmlns:cx1="http://schemas.microsoft.com/office/drawing/2015/9/8/chartex" xmlns:cx2="http://schemas.microsoft.com/office/drawing/2015/10/21/chartex" xmlns:cx3="http://schemas.microsoft.com/office/drawing/2016/5/9/chartex" xmlns:cx4="http://schemas.microsoft.com/office/drawing/2016/5/10/chartex" xmlns:cx5="http://schemas.microsoft.com/office/drawing/2016/5/11/chartex" xmlns:cx6="http://schemas.microsoft.com/office/drawing/2016/5/12/chartex" xmlns:cx7="http://schemas.microsoft.com/office/drawing/2016/5/13/chartex" xmlns:cx8="http://schemas.microsoft.com/office/drawing/2016/5/14/chartex" xmlns:mc="http://schemas.openxmlformats.org/markup-compatibility/2006" xmlns:aink="http://schemas.microsoft.com/office/drawing/2016/ink" xmlns:am3d="http://schemas.microsoft.com/office/drawing/2017/model3d" xmlns:o="urn:schemas-microsoft-com:office:office" xmlns:oel="http://schemas.microsoft.com/office/2019/extlst" xmlns:r="http://purl.oclc.org/ooxml/officeDocument/relationships" xmlns:m="http://purl.oclc.org/ooxml/officeDocument/math" xmlns:v="urn:schemas-microsoft-com:vml" xmlns:wp14="http://schemas.microsoft.com/office/word/2010/wordprocessingDrawing" xmlns:wp="http://purl.oclc.org/ooxml/drawingml/wordprocessingDrawing" xmlns:w10="urn:schemas-microsoft-com:office:word" xmlns:w="http://purl.oclc.org/ooxml/wordprocessingml/main" xmlns:w14="http://schemas.microsoft.com/office/word/2010/wordml" xmlns:w15="http://schemas.microsoft.com/office/word/2012/wordml" xmlns:w16cei="http://schemas.microsoft.com/office/word/2026/wordml/cei" xmlns:w16cex="http://schemas.microsoft.com/office/word/2018/wordml/cex" xmlns:w16cid="http://schemas.microsoft.com/office/word/2016/wordml/cid" xmlns:w16="http://schemas.microsoft.com/office/word/2018/wordml" xmlns:w16du="http://schemas.microsoft.com/office/word/2023/wordml/word16du" xmlns:w16sdtdh="http://schemas.microsoft.com/office/word/2020/wordml/sdtdatahash" xmlns:w16sdtfl="http://schemas.microsoft.com/office/word/2024/wordml/sdtformatlock" xmlns:w16se="http://schemas.microsoft.com/office/word/2015/wordml/symex" xmlns:wpi="http://schemas.microsoft.com/office/word/2010/wordprocessingInk" xmlns:wne="http://schemas.microsoft.com/office/word/2006/wordml" mc:Ignorable="w14 w15 w16se w16cid w16 w16cex w16sdtdh w16sdtfl w16du wne wp14">
   <w:abstractNum w:abstractNumId="0" w15:restartNumberingAfterBreak="0">
     <w:nsid w:val="031D0E77"/>
     <w:multiLevelType w:val="hybridMultilevel"/>
@@ -5355,7 +5923,7 @@
         <w:kern w:val="2"/>
         <w:sz w:val="24"/>
         <w:szCs w:val="24"/>
-        <w:lang w:eastAsia="en-US" w:bidi="ar-SA"/>
+        <w:lang w:val="nl-NL" w:eastAsia="en-US" w:bidi="ar-SA"/>
         <w14:ligatures w14:val="standardContextual"/>
       </w:rPr>
     </w:rPrDefault>
@@ -6277,7 +6845,6 @@
       <w:rFonts w:ascii="MinionPro-Regular" w:hAnsi="MinionPro-Regular" w:cs="MinionPro-Regular"/>
       <w:color w:val="000000"/>
       <w:kern w:val="0"/>
-      <w:lang w:val="nl-NL"/>
     </w:rPr>
   </w:style>
   <w:style w:type="character" w:customStyle="1" w:styleId="Cerios-niveau">
@@ -6307,7 +6874,6 @@
       <w:kern w:val="0"/>
       <w:sz w:val="20"/>
       <w:szCs w:val="22"/>
-      <w:lang w:val="nl-NL"/>
       <w14:ligatures w14:val="none"/>
     </w:rPr>
   </w:style>
@@ -6483,8 +7049,8 @@
     <w:qFormat/>
     <w:rsid w:val="00065B83"/>
     <w:pPr>
+      <w:keepNext/>
       <w:ind w:end="2.35pt"/>
-      <w:keepNext/>
     </w:pPr>
     <w:rPr>
       <w:rFonts w:ascii="Plus Jakarta Sans" w:hAnsi="Plus Jakarta Sans" w:cs="Plus Jakarta Sans"/>
@@ -6507,7 +7073,7 @@
         <w:tab w:val="start" w:pos="134.70pt"/>
       </w:tabs>
       <w:spacing w:after="0pt"/>
-      <w:ind w:end="-44.20pt"/>
+      <w:ind w:end="-43.80pt"/>
     </w:pPr>
     <w:rPr>
       <w:rFonts w:ascii="Wingdings" w:hAnsi="Wingdings"/>
@@ -6839,7 +7405,7 @@
 </file>
 
 <file path=customXml/itemProps1.xml><?xml version="1.0" encoding="utf-8"?>
-<ds:datastoreItem xmlns:ds="http://purl.oclc.org/ooxml/officeDocument/customXml" ds:itemID="{CDF34BA0-A0FF-9548-BE59-1A473431CFBE}">
+<ds:datastoreItem xmlns:ds="http://purl.oclc.org/ooxml/officeDocument/customXml" ds:itemID="{1F118EC6-6FA8-499C-BE8C-AC293388C664}">
   <ds:schemaRefs>
     <ds:schemaRef ds:uri="http://schemas.openxmlformats.org/officeDocument/2006/bibliography"/>
   </ds:schemaRefs>

</xml_diff>